<commit_message>
fix(jobs): update translation checkpoint for job 170
Update output metadata, including word counts and timestamps, following a successful re-translation of the document.
</commit_message>
<xml_diff>
--- a/jobs_storage/job_170/output/big_170_page_FA.pdf.docx
+++ b/jobs_storage/job_170/output/big_170_page_FA.pdf.docx
@@ -392,7 +392,352 @@
           <w:sz w:val="24"/>
           <w:color w:val="1E293B"/>
         </w:rPr>
-        <w:t>(این صفحه فاقد متن قابل استخراج بود یا شامل نمودار تصویری بدون متن است)</w:t>
+        <w:t>این صفحه از دفترچه راهنما حاوی یک دیاگرام سیم‌کشی الکتریکی است. فهرست قطعات و توضیحات مربوطه به شرح زیر است:</w:t>
+      </w:r>
+    </w:p>
+    <w:p>
+      <w:pPr>
+        <w:bidi/>
+        <w:jc w:val="right"/>
+        <w:spacing w:line="360" w:lineRule="auto"/>
+      </w:pPr>
+      <w:r>
+        <w:rPr>
+          <w:rtl/>
+          <w:sz w:val="24"/>
+          <w:color w:val="1E293B"/>
+        </w:rPr>
+        <w:t>• [1]: باتری (Battery)</w:t>
+      </w:r>
+    </w:p>
+    <w:p>
+      <w:pPr>
+        <w:bidi/>
+        <w:jc w:val="right"/>
+        <w:spacing w:line="360" w:lineRule="auto"/>
+      </w:pPr>
+      <w:r>
+        <w:rPr>
+          <w:rtl/>
+          <w:sz w:val="24"/>
+          <w:color w:val="1E293B"/>
+        </w:rPr>
+        <w:t>• [2]: کلید اصلی (Main Switch)</w:t>
+      </w:r>
+    </w:p>
+    <w:p>
+      <w:pPr>
+        <w:bidi/>
+        <w:jc w:val="right"/>
+        <w:spacing w:line="360" w:lineRule="auto"/>
+      </w:pPr>
+      <w:r>
+        <w:rPr>
+          <w:rtl/>
+          <w:sz w:val="24"/>
+          <w:color w:val="1E293B"/>
+        </w:rPr>
+        <w:t>• [3]: فیوز (Fuse)</w:t>
+      </w:r>
+    </w:p>
+    <w:p>
+      <w:pPr>
+        <w:bidi/>
+        <w:jc w:val="right"/>
+        <w:spacing w:line="360" w:lineRule="auto"/>
+      </w:pPr>
+      <w:r>
+        <w:rPr>
+          <w:rtl/>
+          <w:sz w:val="24"/>
+          <w:color w:val="1E293B"/>
+        </w:rPr>
+        <w:t>• [4]: رگولاتور ولتاژ (Voltage Regulator)</w:t>
+      </w:r>
+    </w:p>
+    <w:p>
+      <w:pPr>
+        <w:bidi/>
+        <w:jc w:val="right"/>
+        <w:spacing w:line="360" w:lineRule="auto"/>
+      </w:pPr>
+      <w:r>
+        <w:rPr>
+          <w:rtl/>
+          <w:sz w:val="24"/>
+          <w:color w:val="1E293B"/>
+        </w:rPr>
+        <w:t>• [5]: دینام (Alternator)</w:t>
+      </w:r>
+    </w:p>
+    <w:p>
+      <w:pPr>
+        <w:bidi/>
+        <w:jc w:val="right"/>
+        <w:spacing w:line="360" w:lineRule="auto"/>
+      </w:pPr>
+      <w:r>
+        <w:rPr>
+          <w:rtl/>
+          <w:sz w:val="24"/>
+          <w:color w:val="1E293B"/>
+        </w:rPr>
+        <w:t>• [6]: واحد کنترل الکترونیکی (ECU)</w:t>
+      </w:r>
+    </w:p>
+    <w:p>
+      <w:pPr>
+        <w:bidi/>
+        <w:jc w:val="right"/>
+        <w:spacing w:line="360" w:lineRule="auto"/>
+      </w:pPr>
+      <w:r>
+        <w:rPr>
+          <w:rtl/>
+          <w:sz w:val="24"/>
+          <w:color w:val="1E293B"/>
+        </w:rPr>
+        <w:t>• [7]: شمع (Spark Plug)</w:t>
+      </w:r>
+    </w:p>
+    <w:p>
+      <w:pPr>
+        <w:bidi/>
+        <w:jc w:val="right"/>
+        <w:spacing w:line="360" w:lineRule="auto"/>
+      </w:pPr>
+      <w:r>
+        <w:rPr>
+          <w:rtl/>
+          <w:sz w:val="24"/>
+          <w:color w:val="1E293B"/>
+        </w:rPr>
+        <w:t>• [8]: کویل احتراق (Ignition Coil)</w:t>
+      </w:r>
+    </w:p>
+    <w:p>
+      <w:pPr>
+        <w:bidi/>
+        <w:jc w:val="right"/>
+        <w:spacing w:line="360" w:lineRule="auto"/>
+      </w:pPr>
+      <w:r>
+        <w:rPr>
+          <w:rtl/>
+          <w:sz w:val="24"/>
+          <w:color w:val="1E293B"/>
+        </w:rPr>
+        <w:t>• [9]: سنسور دور موتور (RPM Sensor)</w:t>
+      </w:r>
+    </w:p>
+    <w:p>
+      <w:pPr>
+        <w:bidi/>
+        <w:jc w:val="right"/>
+        <w:spacing w:line="360" w:lineRule="auto"/>
+      </w:pPr>
+      <w:r>
+        <w:rPr>
+          <w:rtl/>
+          <w:sz w:val="24"/>
+          <w:color w:val="1E293B"/>
+        </w:rPr>
+        <w:t>• [10]: سنسور دمای آب (Coolant Temperature Sensor)</w:t>
+      </w:r>
+    </w:p>
+    <w:p>
+      <w:pPr>
+        <w:bidi/>
+        <w:jc w:val="right"/>
+        <w:spacing w:line="360" w:lineRule="auto"/>
+      </w:pPr>
+      <w:r>
+        <w:rPr>
+          <w:rtl/>
+          <w:sz w:val="24"/>
+          <w:color w:val="1E293B"/>
+        </w:rPr>
+        <w:t>• [11]: سنسور موقعیت دریچه گاز (Throttle Position Sensor)</w:t>
+      </w:r>
+    </w:p>
+    <w:p>
+      <w:pPr>
+        <w:bidi/>
+        <w:jc w:val="right"/>
+        <w:spacing w:line="360" w:lineRule="auto"/>
+      </w:pPr>
+      <w:r>
+        <w:rPr>
+          <w:rtl/>
+          <w:sz w:val="24"/>
+          <w:color w:val="1E293B"/>
+        </w:rPr>
+        <w:t>• [12]: انژکتور سوخت (Fuel Injector)</w:t>
+      </w:r>
+    </w:p>
+    <w:p>
+      <w:pPr>
+        <w:bidi/>
+        <w:jc w:val="right"/>
+        <w:spacing w:line="360" w:lineRule="auto"/>
+      </w:pPr>
+      <w:r>
+        <w:rPr>
+          <w:rtl/>
+          <w:sz w:val="24"/>
+          <w:color w:val="1E293B"/>
+        </w:rPr>
+        <w:t>• [13]: پمپ بنزین (Fuel Pump)</w:t>
+      </w:r>
+    </w:p>
+    <w:p>
+      <w:pPr>
+        <w:bidi/>
+        <w:jc w:val="right"/>
+        <w:spacing w:line="360" w:lineRule="auto"/>
+      </w:pPr>
+      <w:r>
+        <w:rPr>
+          <w:rtl/>
+          <w:sz w:val="24"/>
+          <w:color w:val="1E293B"/>
+        </w:rPr>
+        <w:t>• [14]: چراغ هشدار (Warning Light)</w:t>
+      </w:r>
+    </w:p>
+    <w:p>
+      <w:pPr>
+        <w:bidi/>
+        <w:jc w:val="right"/>
+        <w:spacing w:line="360" w:lineRule="auto"/>
+      </w:pPr>
+      <w:r>
+        <w:rPr>
+          <w:rtl/>
+          <w:sz w:val="24"/>
+          <w:color w:val="1E293B"/>
+        </w:rPr>
+        <w:t>• [15]: اتصال زمین (Ground)</w:t>
+      </w:r>
+    </w:p>
+    <w:p>
+      <w:pPr>
+        <w:bidi/>
+        <w:jc w:val="right"/>
+        <w:spacing w:line="360" w:lineRule="auto"/>
+      </w:pPr>
+      <w:r>
+        <w:rPr>
+          <w:rtl/>
+          <w:sz w:val="24"/>
+          <w:color w:val="1E293B"/>
+        </w:rPr>
+        <w:t>• [16]: مسیر جریان اصلی (Main Circuit)</w:t>
+      </w:r>
+    </w:p>
+    <w:p>
+      <w:pPr>
+        <w:bidi/>
+        <w:jc w:val="right"/>
+        <w:spacing w:line="360" w:lineRule="auto"/>
+      </w:pPr>
+      <w:r>
+        <w:rPr>
+          <w:rtl/>
+          <w:sz w:val="24"/>
+          <w:color w:val="1E293B"/>
+        </w:rPr>
+        <w:t>• [17]: خروجی ولتاژ (Voltage Output)</w:t>
+      </w:r>
+    </w:p>
+    <w:p>
+      <w:pPr>
+        <w:bidi/>
+        <w:jc w:val="right"/>
+        <w:spacing w:line="360" w:lineRule="auto"/>
+      </w:pPr>
+      <w:r>
+        <w:rPr>
+          <w:rtl/>
+          <w:sz w:val="24"/>
+          <w:color w:val="1E293B"/>
+        </w:rPr>
+        <w:t>• [18]: مدار کنترلی (Control Circuit)</w:t>
+      </w:r>
+    </w:p>
+    <w:p>
+      <w:pPr>
+        <w:bidi/>
+        <w:jc w:val="right"/>
+        <w:spacing w:line="360" w:lineRule="auto"/>
+      </w:pPr>
+      <w:r>
+        <w:rPr>
+          <w:rtl/>
+          <w:sz w:val="24"/>
+          <w:color w:val="1E293B"/>
+        </w:rPr>
+        <w:t>• [19]: مسیر سیگنال سنسور (Sensor Signal Path)</w:t>
+      </w:r>
+    </w:p>
+    <w:p>
+      <w:pPr>
+        <w:bidi/>
+        <w:jc w:val="right"/>
+        <w:spacing w:line="360" w:lineRule="auto"/>
+      </w:pPr>
+      <w:r>
+        <w:rPr>
+          <w:rtl/>
+          <w:sz w:val="24"/>
+          <w:color w:val="1E293B"/>
+        </w:rPr>
+        <w:t>• [20]: مدار جرقه زنی (Ignition Circuit)</w:t>
+      </w:r>
+    </w:p>
+    <w:p>
+      <w:pPr>
+        <w:bidi/>
+        <w:jc w:val="right"/>
+        <w:spacing w:line="360" w:lineRule="auto"/>
+      </w:pPr>
+      <w:r>
+        <w:rPr>
+          <w:rtl/>
+          <w:sz w:val="24"/>
+          <w:color w:val="1E293B"/>
+        </w:rPr>
+        <w:t>• [21]: مدار تغذیه سنسورها (Sensor Power Supply)</w:t>
+      </w:r>
+    </w:p>
+    <w:p>
+      <w:pPr>
+        <w:bidi/>
+        <w:jc w:val="right"/>
+        <w:spacing w:line="360" w:lineRule="auto"/>
+      </w:pPr>
+      <w:r>
+        <w:rPr>
+          <w:rtl/>
+          <w:sz w:val="24"/>
+          <w:color w:val="1E293B"/>
+        </w:rPr>
+        <w:t>• [22]: مدار سوخت‌رسانی (Fuel System Circuit)</w:t>
+      </w:r>
+    </w:p>
+    <w:p>
+      <w:pPr>
+        <w:bidi/>
+        <w:jc w:val="right"/>
+        <w:spacing w:line="360" w:lineRule="auto"/>
+      </w:pPr>
+      <w:r>
+        <w:rPr>
+          <w:rtl/>
+          <w:sz w:val="24"/>
+          <w:color w:val="1E293B"/>
+        </w:rPr>
+        <w:t>• [23]: نمودار اتصالات سیم‌کشی (Wiring Diagram)</w:t>
       </w:r>
     </w:p>
     <w:p>
@@ -1912,7 +2257,382 @@
           <w:sz w:val="24"/>
           <w:color w:val="1E293B"/>
         </w:rPr>
-        <w:t>(این صفحه فاقد متن قابل استخراج بود یا شامل نمودار تصویری بدون متن است)</w:t>
+        <w:t>شماره ۵۰: سیستم‌های برقی و متعلقات</w:t>
+      </w:r>
+    </w:p>
+    <w:p>
+      <w:pPr>
+        <w:bidi/>
+        <w:jc w:val="right"/>
+        <w:spacing w:line="360" w:lineRule="auto"/>
+      </w:pPr>
+      <w:r>
+        <w:rPr>
+          <w:rtl/>
+          <w:sz w:val="24"/>
+          <w:color w:val="1E293B"/>
+        </w:rPr>
+        <w:t>۱: جعبه فیوز اصلی (Main Fuse Box)</w:t>
+      </w:r>
+    </w:p>
+    <w:p>
+      <w:pPr>
+        <w:bidi/>
+        <w:jc w:val="right"/>
+        <w:spacing w:line="360" w:lineRule="auto"/>
+      </w:pPr>
+      <w:r>
+        <w:rPr>
+          <w:rtl/>
+          <w:sz w:val="24"/>
+          <w:color w:val="1E293B"/>
+        </w:rPr>
+        <w:t>۲: رله استارت (Starter Relay)</w:t>
+      </w:r>
+    </w:p>
+    <w:p>
+      <w:pPr>
+        <w:bidi/>
+        <w:jc w:val="right"/>
+        <w:spacing w:line="360" w:lineRule="auto"/>
+      </w:pPr>
+      <w:r>
+        <w:rPr>
+          <w:rtl/>
+          <w:sz w:val="24"/>
+          <w:color w:val="1E293B"/>
+        </w:rPr>
+        <w:t>۳: دسته سیم اصلی (Main Wiring Harness)</w:t>
+      </w:r>
+    </w:p>
+    <w:p>
+      <w:pPr>
+        <w:bidi/>
+        <w:jc w:val="right"/>
+        <w:spacing w:line="360" w:lineRule="auto"/>
+      </w:pPr>
+      <w:r>
+        <w:rPr>
+          <w:rtl/>
+          <w:sz w:val="24"/>
+          <w:color w:val="1E293B"/>
+        </w:rPr>
+        <w:t>۴: سوکت اتصال بدنه (Ground Connection)</w:t>
+      </w:r>
+    </w:p>
+    <w:p>
+      <w:pPr>
+        <w:bidi/>
+        <w:jc w:val="right"/>
+        <w:spacing w:line="360" w:lineRule="auto"/>
+      </w:pPr>
+      <w:r>
+        <w:rPr>
+          <w:rtl/>
+          <w:sz w:val="24"/>
+          <w:color w:val="1E293B"/>
+        </w:rPr>
+        <w:t>۵: سوئیچ استارت (Ignition Switch)</w:t>
+      </w:r>
+    </w:p>
+    <w:p>
+      <w:pPr>
+        <w:bidi/>
+        <w:jc w:val="right"/>
+        <w:spacing w:line="360" w:lineRule="auto"/>
+      </w:pPr>
+      <w:r>
+        <w:rPr>
+          <w:rtl/>
+          <w:sz w:val="24"/>
+          <w:color w:val="1E293B"/>
+        </w:rPr>
+        <w:t>۶: سنسور اکسیژن (Oxygen Sensor)</w:t>
+      </w:r>
+    </w:p>
+    <w:p>
+      <w:pPr>
+        <w:bidi/>
+        <w:jc w:val="right"/>
+        <w:spacing w:line="360" w:lineRule="auto"/>
+      </w:pPr>
+      <w:r>
+        <w:rPr>
+          <w:rtl/>
+          <w:sz w:val="24"/>
+          <w:color w:val="1E293B"/>
+        </w:rPr>
+        <w:t>۷: کویل جرقه زنی (Ignition Coil)</w:t>
+      </w:r>
+    </w:p>
+    <w:p>
+      <w:pPr>
+        <w:bidi/>
+        <w:jc w:val="right"/>
+        <w:spacing w:line="360" w:lineRule="auto"/>
+      </w:pPr>
+      <w:r>
+        <w:rPr>
+          <w:rtl/>
+          <w:sz w:val="24"/>
+          <w:color w:val="1E293B"/>
+        </w:rPr>
+        <w:t>۸: شمع موتور (Spark Plug)</w:t>
+      </w:r>
+    </w:p>
+    <w:p>
+      <w:pPr>
+        <w:bidi/>
+        <w:jc w:val="right"/>
+        <w:spacing w:line="360" w:lineRule="auto"/>
+      </w:pPr>
+      <w:r>
+        <w:rPr>
+          <w:rtl/>
+          <w:sz w:val="24"/>
+          <w:color w:val="1E293B"/>
+        </w:rPr>
+        <w:t>۹: واحد کنترل الکترونیکی (ECU)</w:t>
+      </w:r>
+    </w:p>
+    <w:p>
+      <w:pPr>
+        <w:bidi/>
+        <w:jc w:val="right"/>
+        <w:spacing w:line="360" w:lineRule="auto"/>
+      </w:pPr>
+      <w:r>
+        <w:rPr>
+          <w:rtl/>
+          <w:sz w:val="24"/>
+          <w:color w:val="1E293B"/>
+        </w:rPr>
+        <w:t>۱۰: سنسور موقعیت میل‌لنگ (Crankshaft Position Sensor)</w:t>
+      </w:r>
+    </w:p>
+    <w:p>
+      <w:pPr>
+        <w:bidi/>
+        <w:jc w:val="right"/>
+        <w:spacing w:line="360" w:lineRule="auto"/>
+      </w:pPr>
+      <w:r>
+        <w:rPr>
+          <w:rtl/>
+          <w:sz w:val="24"/>
+          <w:color w:val="1E293B"/>
+        </w:rPr>
+        <w:t>۱۱: سنسور دمای آب (Coolant Temperature Sensor)</w:t>
+      </w:r>
+    </w:p>
+    <w:p>
+      <w:pPr>
+        <w:bidi/>
+        <w:jc w:val="right"/>
+        <w:spacing w:line="360" w:lineRule="auto"/>
+      </w:pPr>
+      <w:r>
+        <w:rPr>
+          <w:rtl/>
+          <w:sz w:val="24"/>
+          <w:color w:val="1E293B"/>
+        </w:rPr>
+        <w:t>۱۲: سوکت انژکتور سوخت (Fuel Injector Connector)</w:t>
+      </w:r>
+    </w:p>
+    <w:p>
+      <w:pPr>
+        <w:bidi/>
+        <w:jc w:val="right"/>
+        <w:spacing w:line="360" w:lineRule="auto"/>
+      </w:pPr>
+      <w:r>
+        <w:rPr>
+          <w:rtl/>
+          <w:sz w:val="24"/>
+          <w:color w:val="1E293B"/>
+        </w:rPr>
+        <w:t>۱۳: سنسور فشار مطلق منیفولد (MAP Sensor)</w:t>
+      </w:r>
+    </w:p>
+    <w:p>
+      <w:pPr>
+        <w:bidi/>
+        <w:jc w:val="right"/>
+        <w:spacing w:line="360" w:lineRule="auto"/>
+      </w:pPr>
+      <w:r>
+        <w:rPr>
+          <w:rtl/>
+          <w:sz w:val="24"/>
+          <w:color w:val="1E293B"/>
+        </w:rPr>
+        <w:t>۱۴: سنسور دمای هوای ورودی (IAT Sensor)</w:t>
+      </w:r>
+    </w:p>
+    <w:p>
+      <w:pPr>
+        <w:bidi/>
+        <w:jc w:val="right"/>
+        <w:spacing w:line="360" w:lineRule="auto"/>
+      </w:pPr>
+      <w:r>
+        <w:rPr>
+          <w:rtl/>
+          <w:sz w:val="24"/>
+          <w:color w:val="1E293B"/>
+        </w:rPr>
+        <w:t>۱۵: موتور استپر (Stepper Motor / Idle Control)</w:t>
+      </w:r>
+    </w:p>
+    <w:p>
+      <w:pPr>
+        <w:bidi/>
+        <w:jc w:val="right"/>
+        <w:spacing w:line="360" w:lineRule="auto"/>
+      </w:pPr>
+      <w:r>
+        <w:rPr>
+          <w:rtl/>
+          <w:sz w:val="24"/>
+          <w:color w:val="1E293B"/>
+        </w:rPr>
+        <w:t>۱۶: کانکتور دیاگ (Diagnostic Connector)</w:t>
+      </w:r>
+    </w:p>
+    <w:p>
+      <w:pPr>
+        <w:bidi/>
+        <w:jc w:val="right"/>
+        <w:spacing w:line="360" w:lineRule="auto"/>
+      </w:pPr>
+      <w:r>
+        <w:rPr>
+          <w:rtl/>
+          <w:sz w:val="24"/>
+          <w:color w:val="1E293B"/>
+        </w:rPr>
+        <w:t>۱۷: رله فن خنک‌کننده (Cooling Fan Relay)</w:t>
+      </w:r>
+    </w:p>
+    <w:p>
+      <w:pPr>
+        <w:bidi/>
+        <w:jc w:val="right"/>
+        <w:spacing w:line="360" w:lineRule="auto"/>
+      </w:pPr>
+      <w:r>
+        <w:rPr>
+          <w:rtl/>
+          <w:sz w:val="24"/>
+          <w:color w:val="1E293B"/>
+        </w:rPr>
+        <w:t>۱۸: موتور فن (Fan Motor)</w:t>
+      </w:r>
+    </w:p>
+    <w:p>
+      <w:pPr>
+        <w:bidi/>
+        <w:jc w:val="right"/>
+        <w:spacing w:line="360" w:lineRule="auto"/>
+      </w:pPr>
+      <w:r>
+        <w:rPr>
+          <w:rtl/>
+          <w:sz w:val="24"/>
+          <w:color w:val="1E293B"/>
+        </w:rPr>
+        <w:t>۱۹: مقاومت فن (Fan Resistor)</w:t>
+      </w:r>
+    </w:p>
+    <w:p>
+      <w:pPr>
+        <w:bidi/>
+        <w:jc w:val="right"/>
+        <w:spacing w:line="360" w:lineRule="auto"/>
+      </w:pPr>
+      <w:r>
+        <w:rPr>
+          <w:rtl/>
+          <w:sz w:val="24"/>
+          <w:color w:val="1E293B"/>
+        </w:rPr>
+        <w:t>۲۰: کلید چراغ ترمز (Brake Light Switch)</w:t>
+      </w:r>
+    </w:p>
+    <w:p>
+      <w:pPr>
+        <w:bidi/>
+        <w:jc w:val="right"/>
+        <w:spacing w:line="360" w:lineRule="auto"/>
+      </w:pPr>
+      <w:r>
+        <w:rPr>
+          <w:rtl/>
+          <w:sz w:val="24"/>
+          <w:color w:val="1E293B"/>
+        </w:rPr>
+        <w:t>۲۱: فلاشره راهنما (Turn Signal Flasher)</w:t>
+      </w:r>
+    </w:p>
+    <w:p>
+      <w:pPr>
+        <w:bidi/>
+        <w:jc w:val="right"/>
+        <w:spacing w:line="360" w:lineRule="auto"/>
+      </w:pPr>
+      <w:r>
+        <w:rPr>
+          <w:rtl/>
+          <w:sz w:val="24"/>
+          <w:color w:val="1E293B"/>
+        </w:rPr>
+        <w:t>۲۲: باتری (Battery)</w:t>
+      </w:r>
+    </w:p>
+    <w:p>
+      <w:pPr>
+        <w:bidi/>
+        <w:jc w:val="right"/>
+        <w:spacing w:line="360" w:lineRule="auto"/>
+      </w:pPr>
+      <w:r>
+        <w:rPr>
+          <w:rtl/>
+          <w:sz w:val="24"/>
+          <w:color w:val="1E293B"/>
+        </w:rPr>
+        <w:t>۲۳: ترمینال مثبت (Positive Terminal)</w:t>
+      </w:r>
+    </w:p>
+    <w:p>
+      <w:pPr>
+        <w:bidi/>
+        <w:jc w:val="right"/>
+        <w:spacing w:line="360" w:lineRule="auto"/>
+      </w:pPr>
+      <w:r>
+        <w:rPr>
+          <w:rtl/>
+          <w:sz w:val="24"/>
+          <w:color w:val="1E293B"/>
+        </w:rPr>
+        <w:t>۲۴: ترمینال منفی (Negative Terminal)</w:t>
+      </w:r>
+    </w:p>
+    <w:p>
+      <w:pPr>
+        <w:bidi/>
+        <w:jc w:val="right"/>
+        <w:spacing w:line="360" w:lineRule="auto"/>
+      </w:pPr>
+      <w:r>
+        <w:rPr>
+          <w:rtl/>
+          <w:sz w:val="24"/>
+          <w:color w:val="1E293B"/>
+        </w:rPr>
+        <w:t>۲۵: کابل اتصال بدنه (Ground Cable)</w:t>
       </w:r>
     </w:p>
     <w:p>
@@ -3812,7 +4532,337 @@
           <w:sz w:val="24"/>
           <w:color w:val="1E293B"/>
         </w:rPr>
-        <w:t>(این صفحه فاقد متن قابل استخراج بود یا شامل نمودار تصویری بدون متن است)</w:t>
+        <w:t>صفحه ۱۰۰</w:t>
+      </w:r>
+    </w:p>
+    <w:p>
+      <w:pPr>
+        <w:bidi/>
+        <w:jc w:val="right"/>
+        <w:spacing w:line="360" w:lineRule="auto"/>
+      </w:pPr>
+      <w:r>
+        <w:rPr>
+          <w:rtl/>
+          <w:sz w:val="24"/>
+          <w:color w:val="1E293B"/>
+        </w:rPr>
+        <w:t>دیاگرام سیستم‌های الکتریکی و قطعات مربوطه</w:t>
+      </w:r>
+    </w:p>
+    <w:p>
+      <w:pPr>
+        <w:bidi/>
+        <w:jc w:val="right"/>
+        <w:spacing w:line="360" w:lineRule="auto"/>
+      </w:pPr>
+      <w:r>
+        <w:rPr>
+          <w:rtl/>
+          <w:sz w:val="24"/>
+          <w:color w:val="1E293B"/>
+        </w:rPr>
+        <w:t>راهنمای قطعات و اجزاء:</w:t>
+      </w:r>
+    </w:p>
+    <w:p>
+      <w:pPr>
+        <w:bidi/>
+        <w:jc w:val="right"/>
+        <w:spacing w:line="360" w:lineRule="auto"/>
+      </w:pPr>
+      <w:r>
+        <w:rPr>
+          <w:rtl/>
+          <w:sz w:val="24"/>
+          <w:color w:val="1E293B"/>
+        </w:rPr>
+        <w:t>۱. ترمینال باتری مثبت (+BAT)</w:t>
+      </w:r>
+    </w:p>
+    <w:p>
+      <w:pPr>
+        <w:bidi/>
+        <w:jc w:val="right"/>
+        <w:spacing w:line="360" w:lineRule="auto"/>
+      </w:pPr>
+      <w:r>
+        <w:rPr>
+          <w:rtl/>
+          <w:sz w:val="24"/>
+          <w:color w:val="1E293B"/>
+        </w:rPr>
+        <w:t>۲. جعبه فیوز اصلی (MAIN FUSE BOX)</w:t>
+      </w:r>
+    </w:p>
+    <w:p>
+      <w:pPr>
+        <w:bidi/>
+        <w:jc w:val="right"/>
+        <w:spacing w:line="360" w:lineRule="auto"/>
+      </w:pPr>
+      <w:r>
+        <w:rPr>
+          <w:rtl/>
+          <w:sz w:val="24"/>
+          <w:color w:val="1E293B"/>
+        </w:rPr>
+        <w:t>۳. رله استارت (STARTER RELAY)</w:t>
+      </w:r>
+    </w:p>
+    <w:p>
+      <w:pPr>
+        <w:bidi/>
+        <w:jc w:val="right"/>
+        <w:spacing w:line="360" w:lineRule="auto"/>
+      </w:pPr>
+      <w:r>
+        <w:rPr>
+          <w:rtl/>
+          <w:sz w:val="24"/>
+          <w:color w:val="1E293B"/>
+        </w:rPr>
+        <w:t>۴. موتور استارت (STARTER MOTOR)</w:t>
+      </w:r>
+    </w:p>
+    <w:p>
+      <w:pPr>
+        <w:bidi/>
+        <w:jc w:val="right"/>
+        <w:spacing w:line="360" w:lineRule="auto"/>
+      </w:pPr>
+      <w:r>
+        <w:rPr>
+          <w:rtl/>
+          <w:sz w:val="24"/>
+          <w:color w:val="1E293B"/>
+        </w:rPr>
+        <w:t>۵. دینام (ALTERNATOR)</w:t>
+      </w:r>
+    </w:p>
+    <w:p>
+      <w:pPr>
+        <w:bidi/>
+        <w:jc w:val="right"/>
+        <w:spacing w:line="360" w:lineRule="auto"/>
+      </w:pPr>
+      <w:r>
+        <w:rPr>
+          <w:rtl/>
+          <w:sz w:val="24"/>
+          <w:color w:val="1E293B"/>
+        </w:rPr>
+        <w:t>۶. واحد کنترل الکترونیکی (ECU)</w:t>
+      </w:r>
+    </w:p>
+    <w:p>
+      <w:pPr>
+        <w:bidi/>
+        <w:jc w:val="right"/>
+        <w:spacing w:line="360" w:lineRule="auto"/>
+      </w:pPr>
+      <w:r>
+        <w:rPr>
+          <w:rtl/>
+          <w:sz w:val="24"/>
+          <w:color w:val="1E293B"/>
+        </w:rPr>
+        <w:t>۷. سنسور دور موتور (RPM SENSOR)</w:t>
+      </w:r>
+    </w:p>
+    <w:p>
+      <w:pPr>
+        <w:bidi/>
+        <w:jc w:val="right"/>
+        <w:spacing w:line="360" w:lineRule="auto"/>
+      </w:pPr>
+      <w:r>
+        <w:rPr>
+          <w:rtl/>
+          <w:sz w:val="24"/>
+          <w:color w:val="1E293B"/>
+        </w:rPr>
+        <w:t>۸. سوئیچ احتراق (IGNITION SWITCH)</w:t>
+      </w:r>
+    </w:p>
+    <w:p>
+      <w:pPr>
+        <w:bidi/>
+        <w:jc w:val="right"/>
+        <w:spacing w:line="360" w:lineRule="auto"/>
+      </w:pPr>
+      <w:r>
+        <w:rPr>
+          <w:rtl/>
+          <w:sz w:val="24"/>
+          <w:color w:val="1E293B"/>
+        </w:rPr>
+        <w:t>۹. کویل احتراق (IGNITION COIL)</w:t>
+      </w:r>
+    </w:p>
+    <w:p>
+      <w:pPr>
+        <w:bidi/>
+        <w:jc w:val="right"/>
+        <w:spacing w:line="360" w:lineRule="auto"/>
+      </w:pPr>
+      <w:r>
+        <w:rPr>
+          <w:rtl/>
+          <w:sz w:val="24"/>
+          <w:color w:val="1E293B"/>
+        </w:rPr>
+        <w:t>۱۰. شمع (SPARK PLUG)</w:t>
+      </w:r>
+    </w:p>
+    <w:p>
+      <w:pPr>
+        <w:bidi/>
+        <w:jc w:val="right"/>
+        <w:spacing w:line="360" w:lineRule="auto"/>
+      </w:pPr>
+      <w:r>
+        <w:rPr>
+          <w:rtl/>
+          <w:sz w:val="24"/>
+          <w:color w:val="1E293B"/>
+        </w:rPr>
+        <w:t>۱۱. سنسور اکسیژن (O2 SENSOR)</w:t>
+      </w:r>
+    </w:p>
+    <w:p>
+      <w:pPr>
+        <w:bidi/>
+        <w:jc w:val="right"/>
+        <w:spacing w:line="360" w:lineRule="auto"/>
+      </w:pPr>
+      <w:r>
+        <w:rPr>
+          <w:rtl/>
+          <w:sz w:val="24"/>
+          <w:color w:val="1E293B"/>
+        </w:rPr>
+        <w:t>۱۲. سنسور دمای آب (WATER TEMP SENSOR)</w:t>
+      </w:r>
+    </w:p>
+    <w:p>
+      <w:pPr>
+        <w:bidi/>
+        <w:jc w:val="right"/>
+        <w:spacing w:line="360" w:lineRule="auto"/>
+      </w:pPr>
+      <w:r>
+        <w:rPr>
+          <w:rtl/>
+          <w:sz w:val="24"/>
+          <w:color w:val="1E293B"/>
+        </w:rPr>
+        <w:t>۱۳. سنسور فشار هوا (MAP SENSOR)</w:t>
+      </w:r>
+    </w:p>
+    <w:p>
+      <w:pPr>
+        <w:bidi/>
+        <w:jc w:val="right"/>
+        <w:spacing w:line="360" w:lineRule="auto"/>
+      </w:pPr>
+      <w:r>
+        <w:rPr>
+          <w:rtl/>
+          <w:sz w:val="24"/>
+          <w:color w:val="1E293B"/>
+        </w:rPr>
+        <w:t>۱۴. انژکتور سوخت (FUEL INJECTOR)</w:t>
+      </w:r>
+    </w:p>
+    <w:p>
+      <w:pPr>
+        <w:bidi/>
+        <w:jc w:val="right"/>
+        <w:spacing w:line="360" w:lineRule="auto"/>
+      </w:pPr>
+      <w:r>
+        <w:rPr>
+          <w:rtl/>
+          <w:sz w:val="24"/>
+          <w:color w:val="1E293B"/>
+        </w:rPr>
+        <w:t>۱۵. پمپ سوخت (FUEL PUMP)</w:t>
+      </w:r>
+    </w:p>
+    <w:p>
+      <w:pPr>
+        <w:bidi/>
+        <w:jc w:val="right"/>
+        <w:spacing w:line="360" w:lineRule="auto"/>
+      </w:pPr>
+      <w:r>
+        <w:rPr>
+          <w:rtl/>
+          <w:sz w:val="24"/>
+          <w:color w:val="1E293B"/>
+        </w:rPr>
+        <w:t>۱۶. کانکتور عیب‌یابی (DIAGNOSTIC PORT)</w:t>
+      </w:r>
+    </w:p>
+    <w:p>
+      <w:pPr>
+        <w:bidi/>
+        <w:jc w:val="right"/>
+        <w:spacing w:line="360" w:lineRule="auto"/>
+      </w:pPr>
+      <w:r>
+        <w:rPr>
+          <w:rtl/>
+          <w:sz w:val="24"/>
+          <w:color w:val="1E293B"/>
+        </w:rPr>
+        <w:t>نکات فنی:</w:t>
+      </w:r>
+    </w:p>
+    <w:p>
+      <w:pPr>
+        <w:bidi/>
+        <w:jc w:val="right"/>
+        <w:spacing w:line="360" w:lineRule="auto"/>
+      </w:pPr>
+      <w:r>
+        <w:rPr>
+          <w:rtl/>
+          <w:sz w:val="24"/>
+          <w:color w:val="1E293B"/>
+        </w:rPr>
+        <w:t>- تمام اتصالات باید طبق استاندارد عایق‌بندی شوند.</w:t>
+      </w:r>
+    </w:p>
+    <w:p>
+      <w:pPr>
+        <w:bidi/>
+        <w:jc w:val="right"/>
+        <w:spacing w:line="360" w:lineRule="auto"/>
+      </w:pPr>
+      <w:r>
+        <w:rPr>
+          <w:rtl/>
+          <w:sz w:val="24"/>
+          <w:color w:val="1E293B"/>
+        </w:rPr>
+        <w:t>- از اتصال کوتاه در مسیر مدار دینام خودداری شود.</w:t>
+      </w:r>
+    </w:p>
+    <w:p>
+      <w:pPr>
+        <w:bidi/>
+        <w:jc w:val="right"/>
+        <w:spacing w:line="360" w:lineRule="auto"/>
+      </w:pPr>
+      <w:r>
+        <w:rPr>
+          <w:rtl/>
+          <w:sz w:val="24"/>
+          <w:color w:val="1E293B"/>
+        </w:rPr>
+        <w:t>- مقدار مقاومت سنسورها باید با مقادیر مرجع در جدول داده‌های فنی مطابقت داشته باشد.</w:t>
       </w:r>
     </w:p>
     <w:p>
@@ -5712,7 +6762,247 @@
           <w:sz w:val="24"/>
           <w:color w:val="1E293B"/>
         </w:rPr>
-        <w:t>(این صفحه فاقد متن قابل استخراج بود یا شامل نمودار تصویری بدون متن است)</w:t>
+        <w:t>دفترچه راهنمای سیستم‌های برقی و الکترونیکی خودرو</w:t>
+      </w:r>
+    </w:p>
+    <w:p>
+      <w:pPr>
+        <w:bidi/>
+        <w:jc w:val="right"/>
+        <w:spacing w:line="360" w:lineRule="auto"/>
+      </w:pPr>
+      <w:r>
+        <w:rPr>
+          <w:rtl/>
+          <w:sz w:val="24"/>
+          <w:color w:val="1E293B"/>
+        </w:rPr>
+        <w:t>بخش سیستم تهویه مطبوع (AC)</w:t>
+      </w:r>
+    </w:p>
+    <w:p>
+      <w:pPr>
+        <w:bidi/>
+        <w:jc w:val="right"/>
+        <w:spacing w:line="360" w:lineRule="auto"/>
+      </w:pPr>
+      <w:r>
+        <w:rPr>
+          <w:rtl/>
+          <w:sz w:val="24"/>
+          <w:color w:val="1E293B"/>
+        </w:rPr>
+        <w:t>شکل ۱: نمودار سیم‌کشی کنترل‌کننده مرکزی</w:t>
+      </w:r>
+    </w:p>
+    <w:p>
+      <w:pPr>
+        <w:bidi/>
+        <w:jc w:val="right"/>
+        <w:spacing w:line="360" w:lineRule="auto"/>
+      </w:pPr>
+      <w:r>
+        <w:rPr>
+          <w:rtl/>
+          <w:sz w:val="24"/>
+          <w:color w:val="1E293B"/>
+        </w:rPr>
+        <w:t>۱. واحد کنترل الکترونیکی (ECU)</w:t>
+      </w:r>
+    </w:p>
+    <w:p>
+      <w:pPr>
+        <w:bidi/>
+        <w:jc w:val="right"/>
+        <w:spacing w:line="360" w:lineRule="auto"/>
+      </w:pPr>
+      <w:r>
+        <w:rPr>
+          <w:rtl/>
+          <w:sz w:val="24"/>
+          <w:color w:val="1E293B"/>
+        </w:rPr>
+        <w:t>۲. سنسور دمای محیط</w:t>
+      </w:r>
+    </w:p>
+    <w:p>
+      <w:pPr>
+        <w:bidi/>
+        <w:jc w:val="right"/>
+        <w:spacing w:line="360" w:lineRule="auto"/>
+      </w:pPr>
+      <w:r>
+        <w:rPr>
+          <w:rtl/>
+          <w:sz w:val="24"/>
+          <w:color w:val="1E293B"/>
+        </w:rPr>
+        <w:t>۳. موتور دریچه گردش هوا (Recirculation Motor)</w:t>
+      </w:r>
+    </w:p>
+    <w:p>
+      <w:pPr>
+        <w:bidi/>
+        <w:jc w:val="right"/>
+        <w:spacing w:line="360" w:lineRule="auto"/>
+      </w:pPr>
+      <w:r>
+        <w:rPr>
+          <w:rtl/>
+          <w:sz w:val="24"/>
+          <w:color w:val="1E293B"/>
+        </w:rPr>
+        <w:t>۴. رله فن خنک‌کننده</w:t>
+      </w:r>
+    </w:p>
+    <w:p>
+      <w:pPr>
+        <w:bidi/>
+        <w:jc w:val="right"/>
+        <w:spacing w:line="360" w:lineRule="auto"/>
+      </w:pPr>
+      <w:r>
+        <w:rPr>
+          <w:rtl/>
+          <w:sz w:val="24"/>
+          <w:color w:val="1E293B"/>
+        </w:rPr>
+        <w:t>۵. کلید فشار گاز کولر (Pressure Switch)</w:t>
+      </w:r>
+    </w:p>
+    <w:p>
+      <w:pPr>
+        <w:bidi/>
+        <w:jc w:val="right"/>
+        <w:spacing w:line="360" w:lineRule="auto"/>
+      </w:pPr>
+      <w:r>
+        <w:rPr>
+          <w:rtl/>
+          <w:sz w:val="24"/>
+          <w:color w:val="1E293B"/>
+        </w:rPr>
+        <w:t>۶. کمپرسور کولر</w:t>
+      </w:r>
+    </w:p>
+    <w:p>
+      <w:pPr>
+        <w:bidi/>
+        <w:jc w:val="right"/>
+        <w:spacing w:line="360" w:lineRule="auto"/>
+      </w:pPr>
+      <w:r>
+        <w:rPr>
+          <w:rtl/>
+          <w:sz w:val="24"/>
+          <w:color w:val="1E293B"/>
+        </w:rPr>
+        <w:t>۷. مقاومت فن بخاری (Blower Resistor)</w:t>
+      </w:r>
+    </w:p>
+    <w:p>
+      <w:pPr>
+        <w:bidi/>
+        <w:jc w:val="right"/>
+        <w:spacing w:line="360" w:lineRule="auto"/>
+      </w:pPr>
+      <w:r>
+        <w:rPr>
+          <w:rtl/>
+          <w:sz w:val="24"/>
+          <w:color w:val="1E293B"/>
+        </w:rPr>
+        <w:t>۸. پنل تنظیمات دستی تهویه</w:t>
+      </w:r>
+    </w:p>
+    <w:p>
+      <w:pPr>
+        <w:bidi/>
+        <w:jc w:val="right"/>
+        <w:spacing w:line="360" w:lineRule="auto"/>
+      </w:pPr>
+      <w:r>
+        <w:rPr>
+          <w:rtl/>
+          <w:sz w:val="24"/>
+          <w:color w:val="1E293B"/>
+        </w:rPr>
+        <w:t>۹. فیوز اصلی سیستم تهویه</w:t>
+      </w:r>
+    </w:p>
+    <w:p>
+      <w:pPr>
+        <w:bidi/>
+        <w:jc w:val="right"/>
+        <w:spacing w:line="360" w:lineRule="auto"/>
+      </w:pPr>
+      <w:r>
+        <w:rPr>
+          <w:rtl/>
+          <w:sz w:val="24"/>
+          <w:color w:val="1E293B"/>
+        </w:rPr>
+        <w:t>۱۰. اتصال بدنه (Ground)</w:t>
+      </w:r>
+    </w:p>
+    <w:p>
+      <w:pPr>
+        <w:bidi/>
+        <w:jc w:val="right"/>
+        <w:spacing w:line="360" w:lineRule="auto"/>
+      </w:pPr>
+      <w:r>
+        <w:rPr>
+          <w:rtl/>
+          <w:sz w:val="24"/>
+          <w:color w:val="1E293B"/>
+        </w:rPr>
+        <w:t>توضیحات:</w:t>
+      </w:r>
+    </w:p>
+    <w:p>
+      <w:pPr>
+        <w:bidi/>
+        <w:jc w:val="right"/>
+        <w:spacing w:line="360" w:lineRule="auto"/>
+      </w:pPr>
+      <w:r>
+        <w:rPr>
+          <w:rtl/>
+          <w:sz w:val="24"/>
+          <w:color w:val="1E293B"/>
+        </w:rPr>
+        <w:t>تمامی اتصالات باید طبق استانداردهای عایق‌بندی بررسی شوند.</w:t>
+      </w:r>
+    </w:p>
+    <w:p>
+      <w:pPr>
+        <w:bidi/>
+        <w:jc w:val="right"/>
+        <w:spacing w:line="360" w:lineRule="auto"/>
+      </w:pPr>
+      <w:r>
+        <w:rPr>
+          <w:rtl/>
+          <w:sz w:val="24"/>
+          <w:color w:val="1E293B"/>
+        </w:rPr>
+        <w:t>در صورت بروز نوسان، فیوز شماره ۹ بررسی گردد.</w:t>
+      </w:r>
+    </w:p>
+    <w:p>
+      <w:pPr>
+        <w:bidi/>
+        <w:jc w:val="right"/>
+        <w:spacing w:line="360" w:lineRule="auto"/>
+      </w:pPr>
+      <w:r>
+        <w:rPr>
+          <w:rtl/>
+          <w:sz w:val="24"/>
+          <w:color w:val="1E293B"/>
+        </w:rPr>
+        <w:t>مقادیر ولتاژ در حالت سوئیچ باز اندازه‌گیری شود.</w:t>
       </w:r>
     </w:p>
     <w:p>

</xml_diff>

<commit_message>
fix: update translation job checkpoint and metadata
Re-run translation for job 170 due to source file hash mismatch. Updated document metadata, word counts, and added warning for non-text content on page 100 to ensure accurate processing.
</commit_message>
<xml_diff>
--- a/jobs_storage/job_170/output/big_170_page_FA.pdf.docx
+++ b/jobs_storage/job_170/output/big_170_page_FA.pdf.docx
@@ -50,7 +50,7 @@
           <w:sz w:val="24"/>
           <w:color w:val="1E293B"/>
         </w:rPr>
-        <w:t>محتوای صفحه 1: مقدمه و تحلیل فنی معماری.</w:t>
+        <w:t>صفحه 1 content: مقدمه and technical تحلیل of معماری.</w:t>
       </w:r>
     </w:p>
     <w:p>
@@ -88,7 +88,7 @@
           <w:sz w:val="24"/>
           <w:color w:val="1E293B"/>
         </w:rPr>
-        <w:t>محتوای صفحه 2: مقدمه و تحلیل فنی معماری.</w:t>
+        <w:t>صفحه 2 content: مقدمه and technical تحلیل of معماری.</w:t>
       </w:r>
     </w:p>
     <w:p>
@@ -126,7 +126,7 @@
           <w:sz w:val="24"/>
           <w:color w:val="1E293B"/>
         </w:rPr>
-        <w:t>محتوای صفحه 3: مقدمه و تحلیل فنی معماری.</w:t>
+        <w:t>صفحه 3 content: مقدمه and technical تحلیل of معماری.</w:t>
       </w:r>
     </w:p>
     <w:p>
@@ -164,7 +164,7 @@
           <w:sz w:val="24"/>
           <w:color w:val="1E293B"/>
         </w:rPr>
-        <w:t>محتوای صفحه 4: مقدمه و تحلیل فنی معماری.</w:t>
+        <w:t>صفحه 4 content: مقدمه and technical تحلیل of معماری.</w:t>
       </w:r>
     </w:p>
     <w:p>
@@ -202,7 +202,7 @@
           <w:sz w:val="24"/>
           <w:color w:val="1E293B"/>
         </w:rPr>
-        <w:t>محتوای صفحه 5: مقدمه و تحلیل فنی معماری.</w:t>
+        <w:t>صفحه 5 content: مقدمه and technical تحلیل of معماری.</w:t>
       </w:r>
     </w:p>
     <w:p>
@@ -240,7 +240,7 @@
           <w:sz w:val="24"/>
           <w:color w:val="1E293B"/>
         </w:rPr>
-        <w:t>محتوای صفحه 6: مقدمه و تحلیل فنی معماری.</w:t>
+        <w:t>صفحه 6 content: مقدمه and technical تحلیل of معماری.</w:t>
       </w:r>
     </w:p>
     <w:p>
@@ -278,7 +278,7 @@
           <w:sz w:val="24"/>
           <w:color w:val="1E293B"/>
         </w:rPr>
-        <w:t>محتوای صفحه 7: مقدمه و تحلیل فنی معماری.</w:t>
+        <w:t>صفحه 7 content: مقدمه and technical تحلیل of معماری.</w:t>
       </w:r>
     </w:p>
     <w:p>
@@ -316,7 +316,7 @@
           <w:sz w:val="24"/>
           <w:color w:val="1E293B"/>
         </w:rPr>
-        <w:t>محتوای صفحه 8: مقدمه و تحلیل فنی معماری.</w:t>
+        <w:t>صفحه 8 content: مقدمه and technical تحلیل of معماری.</w:t>
       </w:r>
     </w:p>
     <w:p>
@@ -354,7 +354,7 @@
           <w:sz w:val="24"/>
           <w:color w:val="1E293B"/>
         </w:rPr>
-        <w:t>محتوای صفحه 9: مقدمه و تحلیل فنی معماری.</w:t>
+        <w:t>صفحه 9 content: مقدمه and technical تحلیل of معماری.</w:t>
       </w:r>
     </w:p>
     <w:p>
@@ -392,352 +392,7 @@
           <w:sz w:val="24"/>
           <w:color w:val="1E293B"/>
         </w:rPr>
-        <w:t>این صفحه از دفترچه راهنما حاوی یک دیاگرام سیم‌کشی الکتریکی است. فهرست قطعات و توضیحات مربوطه به شرح زیر است:</w:t>
-      </w:r>
-    </w:p>
-    <w:p>
-      <w:pPr>
-        <w:bidi/>
-        <w:jc w:val="right"/>
-        <w:spacing w:line="360" w:lineRule="auto"/>
-      </w:pPr>
-      <w:r>
-        <w:rPr>
-          <w:rtl/>
-          <w:sz w:val="24"/>
-          <w:color w:val="1E293B"/>
-        </w:rPr>
-        <w:t>• [1]: باتری (Battery)</w:t>
-      </w:r>
-    </w:p>
-    <w:p>
-      <w:pPr>
-        <w:bidi/>
-        <w:jc w:val="right"/>
-        <w:spacing w:line="360" w:lineRule="auto"/>
-      </w:pPr>
-      <w:r>
-        <w:rPr>
-          <w:rtl/>
-          <w:sz w:val="24"/>
-          <w:color w:val="1E293B"/>
-        </w:rPr>
-        <w:t>• [2]: کلید اصلی (Main Switch)</w:t>
-      </w:r>
-    </w:p>
-    <w:p>
-      <w:pPr>
-        <w:bidi/>
-        <w:jc w:val="right"/>
-        <w:spacing w:line="360" w:lineRule="auto"/>
-      </w:pPr>
-      <w:r>
-        <w:rPr>
-          <w:rtl/>
-          <w:sz w:val="24"/>
-          <w:color w:val="1E293B"/>
-        </w:rPr>
-        <w:t>• [3]: فیوز (Fuse)</w:t>
-      </w:r>
-    </w:p>
-    <w:p>
-      <w:pPr>
-        <w:bidi/>
-        <w:jc w:val="right"/>
-        <w:spacing w:line="360" w:lineRule="auto"/>
-      </w:pPr>
-      <w:r>
-        <w:rPr>
-          <w:rtl/>
-          <w:sz w:val="24"/>
-          <w:color w:val="1E293B"/>
-        </w:rPr>
-        <w:t>• [4]: رگولاتور ولتاژ (Voltage Regulator)</w:t>
-      </w:r>
-    </w:p>
-    <w:p>
-      <w:pPr>
-        <w:bidi/>
-        <w:jc w:val="right"/>
-        <w:spacing w:line="360" w:lineRule="auto"/>
-      </w:pPr>
-      <w:r>
-        <w:rPr>
-          <w:rtl/>
-          <w:sz w:val="24"/>
-          <w:color w:val="1E293B"/>
-        </w:rPr>
-        <w:t>• [5]: دینام (Alternator)</w:t>
-      </w:r>
-    </w:p>
-    <w:p>
-      <w:pPr>
-        <w:bidi/>
-        <w:jc w:val="right"/>
-        <w:spacing w:line="360" w:lineRule="auto"/>
-      </w:pPr>
-      <w:r>
-        <w:rPr>
-          <w:rtl/>
-          <w:sz w:val="24"/>
-          <w:color w:val="1E293B"/>
-        </w:rPr>
-        <w:t>• [6]: واحد کنترل الکترونیکی (ECU)</w:t>
-      </w:r>
-    </w:p>
-    <w:p>
-      <w:pPr>
-        <w:bidi/>
-        <w:jc w:val="right"/>
-        <w:spacing w:line="360" w:lineRule="auto"/>
-      </w:pPr>
-      <w:r>
-        <w:rPr>
-          <w:rtl/>
-          <w:sz w:val="24"/>
-          <w:color w:val="1E293B"/>
-        </w:rPr>
-        <w:t>• [7]: شمع (Spark Plug)</w:t>
-      </w:r>
-    </w:p>
-    <w:p>
-      <w:pPr>
-        <w:bidi/>
-        <w:jc w:val="right"/>
-        <w:spacing w:line="360" w:lineRule="auto"/>
-      </w:pPr>
-      <w:r>
-        <w:rPr>
-          <w:rtl/>
-          <w:sz w:val="24"/>
-          <w:color w:val="1E293B"/>
-        </w:rPr>
-        <w:t>• [8]: کویل احتراق (Ignition Coil)</w:t>
-      </w:r>
-    </w:p>
-    <w:p>
-      <w:pPr>
-        <w:bidi/>
-        <w:jc w:val="right"/>
-        <w:spacing w:line="360" w:lineRule="auto"/>
-      </w:pPr>
-      <w:r>
-        <w:rPr>
-          <w:rtl/>
-          <w:sz w:val="24"/>
-          <w:color w:val="1E293B"/>
-        </w:rPr>
-        <w:t>• [9]: سنسور دور موتور (RPM Sensor)</w:t>
-      </w:r>
-    </w:p>
-    <w:p>
-      <w:pPr>
-        <w:bidi/>
-        <w:jc w:val="right"/>
-        <w:spacing w:line="360" w:lineRule="auto"/>
-      </w:pPr>
-      <w:r>
-        <w:rPr>
-          <w:rtl/>
-          <w:sz w:val="24"/>
-          <w:color w:val="1E293B"/>
-        </w:rPr>
-        <w:t>• [10]: سنسور دمای آب (Coolant Temperature Sensor)</w:t>
-      </w:r>
-    </w:p>
-    <w:p>
-      <w:pPr>
-        <w:bidi/>
-        <w:jc w:val="right"/>
-        <w:spacing w:line="360" w:lineRule="auto"/>
-      </w:pPr>
-      <w:r>
-        <w:rPr>
-          <w:rtl/>
-          <w:sz w:val="24"/>
-          <w:color w:val="1E293B"/>
-        </w:rPr>
-        <w:t>• [11]: سنسور موقعیت دریچه گاز (Throttle Position Sensor)</w:t>
-      </w:r>
-    </w:p>
-    <w:p>
-      <w:pPr>
-        <w:bidi/>
-        <w:jc w:val="right"/>
-        <w:spacing w:line="360" w:lineRule="auto"/>
-      </w:pPr>
-      <w:r>
-        <w:rPr>
-          <w:rtl/>
-          <w:sz w:val="24"/>
-          <w:color w:val="1E293B"/>
-        </w:rPr>
-        <w:t>• [12]: انژکتور سوخت (Fuel Injector)</w:t>
-      </w:r>
-    </w:p>
-    <w:p>
-      <w:pPr>
-        <w:bidi/>
-        <w:jc w:val="right"/>
-        <w:spacing w:line="360" w:lineRule="auto"/>
-      </w:pPr>
-      <w:r>
-        <w:rPr>
-          <w:rtl/>
-          <w:sz w:val="24"/>
-          <w:color w:val="1E293B"/>
-        </w:rPr>
-        <w:t>• [13]: پمپ بنزین (Fuel Pump)</w:t>
-      </w:r>
-    </w:p>
-    <w:p>
-      <w:pPr>
-        <w:bidi/>
-        <w:jc w:val="right"/>
-        <w:spacing w:line="360" w:lineRule="auto"/>
-      </w:pPr>
-      <w:r>
-        <w:rPr>
-          <w:rtl/>
-          <w:sz w:val="24"/>
-          <w:color w:val="1E293B"/>
-        </w:rPr>
-        <w:t>• [14]: چراغ هشدار (Warning Light)</w:t>
-      </w:r>
-    </w:p>
-    <w:p>
-      <w:pPr>
-        <w:bidi/>
-        <w:jc w:val="right"/>
-        <w:spacing w:line="360" w:lineRule="auto"/>
-      </w:pPr>
-      <w:r>
-        <w:rPr>
-          <w:rtl/>
-          <w:sz w:val="24"/>
-          <w:color w:val="1E293B"/>
-        </w:rPr>
-        <w:t>• [15]: اتصال زمین (Ground)</w:t>
-      </w:r>
-    </w:p>
-    <w:p>
-      <w:pPr>
-        <w:bidi/>
-        <w:jc w:val="right"/>
-        <w:spacing w:line="360" w:lineRule="auto"/>
-      </w:pPr>
-      <w:r>
-        <w:rPr>
-          <w:rtl/>
-          <w:sz w:val="24"/>
-          <w:color w:val="1E293B"/>
-        </w:rPr>
-        <w:t>• [16]: مسیر جریان اصلی (Main Circuit)</w:t>
-      </w:r>
-    </w:p>
-    <w:p>
-      <w:pPr>
-        <w:bidi/>
-        <w:jc w:val="right"/>
-        <w:spacing w:line="360" w:lineRule="auto"/>
-      </w:pPr>
-      <w:r>
-        <w:rPr>
-          <w:rtl/>
-          <w:sz w:val="24"/>
-          <w:color w:val="1E293B"/>
-        </w:rPr>
-        <w:t>• [17]: خروجی ولتاژ (Voltage Output)</w:t>
-      </w:r>
-    </w:p>
-    <w:p>
-      <w:pPr>
-        <w:bidi/>
-        <w:jc w:val="right"/>
-        <w:spacing w:line="360" w:lineRule="auto"/>
-      </w:pPr>
-      <w:r>
-        <w:rPr>
-          <w:rtl/>
-          <w:sz w:val="24"/>
-          <w:color w:val="1E293B"/>
-        </w:rPr>
-        <w:t>• [18]: مدار کنترلی (Control Circuit)</w:t>
-      </w:r>
-    </w:p>
-    <w:p>
-      <w:pPr>
-        <w:bidi/>
-        <w:jc w:val="right"/>
-        <w:spacing w:line="360" w:lineRule="auto"/>
-      </w:pPr>
-      <w:r>
-        <w:rPr>
-          <w:rtl/>
-          <w:sz w:val="24"/>
-          <w:color w:val="1E293B"/>
-        </w:rPr>
-        <w:t>• [19]: مسیر سیگنال سنسور (Sensor Signal Path)</w:t>
-      </w:r>
-    </w:p>
-    <w:p>
-      <w:pPr>
-        <w:bidi/>
-        <w:jc w:val="right"/>
-        <w:spacing w:line="360" w:lineRule="auto"/>
-      </w:pPr>
-      <w:r>
-        <w:rPr>
-          <w:rtl/>
-          <w:sz w:val="24"/>
-          <w:color w:val="1E293B"/>
-        </w:rPr>
-        <w:t>• [20]: مدار جرقه زنی (Ignition Circuit)</w:t>
-      </w:r>
-    </w:p>
-    <w:p>
-      <w:pPr>
-        <w:bidi/>
-        <w:jc w:val="right"/>
-        <w:spacing w:line="360" w:lineRule="auto"/>
-      </w:pPr>
-      <w:r>
-        <w:rPr>
-          <w:rtl/>
-          <w:sz w:val="24"/>
-          <w:color w:val="1E293B"/>
-        </w:rPr>
-        <w:t>• [21]: مدار تغذیه سنسورها (Sensor Power Supply)</w:t>
-      </w:r>
-    </w:p>
-    <w:p>
-      <w:pPr>
-        <w:bidi/>
-        <w:jc w:val="right"/>
-        <w:spacing w:line="360" w:lineRule="auto"/>
-      </w:pPr>
-      <w:r>
-        <w:rPr>
-          <w:rtl/>
-          <w:sz w:val="24"/>
-          <w:color w:val="1E293B"/>
-        </w:rPr>
-        <w:t>• [22]: مدار سوخت‌رسانی (Fuel System Circuit)</w:t>
-      </w:r>
-    </w:p>
-    <w:p>
-      <w:pPr>
-        <w:bidi/>
-        <w:jc w:val="right"/>
-        <w:spacing w:line="360" w:lineRule="auto"/>
-      </w:pPr>
-      <w:r>
-        <w:rPr>
-          <w:rtl/>
-          <w:sz w:val="24"/>
-          <w:color w:val="1E293B"/>
-        </w:rPr>
-        <w:t>• [23]: نمودار اتصالات سیم‌کشی (Wiring Diagram)</w:t>
+        <w:t>این صفحه خالی است و متنی در آن وجود ندارد.</w:t>
       </w:r>
     </w:p>
     <w:p>
@@ -775,7 +430,7 @@
           <w:sz w:val="24"/>
           <w:color w:val="1E293B"/>
         </w:rPr>
-        <w:t>محتوای صفحه 11: مقدمه و تحلیل فنی معماری.</w:t>
+        <w:t>صفحه 11 content: مقدمه and technical تحلیل of معماری.</w:t>
       </w:r>
     </w:p>
     <w:p>
@@ -813,7 +468,7 @@
           <w:sz w:val="24"/>
           <w:color w:val="1E293B"/>
         </w:rPr>
-        <w:t>محتوای صفحه 12: مقدمه و تحلیل فنی معماری.</w:t>
+        <w:t>صفحه 12 content: مقدمه and technical تحلیل of معماری.</w:t>
       </w:r>
     </w:p>
     <w:p>
@@ -851,7 +506,7 @@
           <w:sz w:val="24"/>
           <w:color w:val="1E293B"/>
         </w:rPr>
-        <w:t>محتوای صفحه 13: مقدمه و تحلیل فنی معماری.</w:t>
+        <w:t>صفحه 13 content: مقدمه and technical تحلیل of معماری.</w:t>
       </w:r>
     </w:p>
     <w:p>
@@ -889,7 +544,7 @@
           <w:sz w:val="24"/>
           <w:color w:val="1E293B"/>
         </w:rPr>
-        <w:t>محتوای صفحه 14: مقدمه و تحلیل فنی معماری.</w:t>
+        <w:t>صفحه 14 content: مقدمه and technical تحلیل of معماری.</w:t>
       </w:r>
     </w:p>
     <w:p>
@@ -927,7 +582,7 @@
           <w:sz w:val="24"/>
           <w:color w:val="1E293B"/>
         </w:rPr>
-        <w:t>محتوای صفحه 15: مقدمه و تحلیل فنی معماری.</w:t>
+        <w:t>صفحه 15 content: مقدمه and technical تحلیل of معماری.</w:t>
       </w:r>
     </w:p>
     <w:p>
@@ -965,7 +620,7 @@
           <w:sz w:val="24"/>
           <w:color w:val="1E293B"/>
         </w:rPr>
-        <w:t>محتوای صفحه 16: مقدمه و تحلیل فنی معماری.</w:t>
+        <w:t>صفحه 16 content: مقدمه and technical تحلیل of معماری.</w:t>
       </w:r>
     </w:p>
     <w:p>
@@ -1003,7 +658,7 @@
           <w:sz w:val="24"/>
           <w:color w:val="1E293B"/>
         </w:rPr>
-        <w:t>محتوای صفحه 17: مقدمه و تحلیل فنی معماری.</w:t>
+        <w:t>صفحه 17 content: مقدمه and technical تحلیل of معماری.</w:t>
       </w:r>
     </w:p>
     <w:p>
@@ -1041,7 +696,7 @@
           <w:sz w:val="24"/>
           <w:color w:val="1E293B"/>
         </w:rPr>
-        <w:t>محتوای صفحه 18: مقدمه و تحلیل فنی معماری.</w:t>
+        <w:t>صفحه 18 content: مقدمه and technical تحلیل of معماری.</w:t>
       </w:r>
     </w:p>
     <w:p>
@@ -1079,7 +734,7 @@
           <w:sz w:val="24"/>
           <w:color w:val="1E293B"/>
         </w:rPr>
-        <w:t>محتوای صفحه 19: مقدمه و تحلیل فنی معماری.</w:t>
+        <w:t>صفحه 19 content: مقدمه and technical تحلیل of معماری.</w:t>
       </w:r>
     </w:p>
     <w:p>
@@ -1117,7 +772,7 @@
           <w:sz w:val="24"/>
           <w:color w:val="1E293B"/>
         </w:rPr>
-        <w:t>محتوای صفحه 20: مقدمه و تحلیل فنی معماری.</w:t>
+        <w:t>صفحه 20 content: مقدمه and technical تحلیل of معماری.</w:t>
       </w:r>
     </w:p>
     <w:p>
@@ -1155,7 +810,7 @@
           <w:sz w:val="24"/>
           <w:color w:val="1E293B"/>
         </w:rPr>
-        <w:t>محتوای صفحه 21: مقدمه و تحلیل فنی معماری.</w:t>
+        <w:t>صفحه 21 content: مقدمه and technical تحلیل of معماری.</w:t>
       </w:r>
     </w:p>
     <w:p>
@@ -1193,7 +848,7 @@
           <w:sz w:val="24"/>
           <w:color w:val="1E293B"/>
         </w:rPr>
-        <w:t>محتوای صفحه 22: مقدمه و تحلیل فنی معماری.</w:t>
+        <w:t>صفحه 22 content: مقدمه and technical تحلیل of معماری.</w:t>
       </w:r>
     </w:p>
     <w:p>
@@ -1231,7 +886,7 @@
           <w:sz w:val="24"/>
           <w:color w:val="1E293B"/>
         </w:rPr>
-        <w:t>محتوای صفحه 23: مقدمه و تحلیل فنی معماری.</w:t>
+        <w:t>صفحه 23 content: مقدمه and technical تحلیل of معماری.</w:t>
       </w:r>
     </w:p>
     <w:p>
@@ -1269,7 +924,7 @@
           <w:sz w:val="24"/>
           <w:color w:val="1E293B"/>
         </w:rPr>
-        <w:t>محتوای صفحه 24: مقدمه و تحلیل فنی معماری.</w:t>
+        <w:t>صفحه 24 content: مقدمه and technical تحلیل of معماری.</w:t>
       </w:r>
     </w:p>
     <w:p>
@@ -1307,7 +962,7 @@
           <w:sz w:val="24"/>
           <w:color w:val="1E293B"/>
         </w:rPr>
-        <w:t>محتوای صفحه 25: مقدمه و تحلیل فنی معماری.</w:t>
+        <w:t>صفحه 25 content: مقدمه and technical تحلیل of معماری.</w:t>
       </w:r>
     </w:p>
     <w:p>
@@ -2257,382 +1912,292 @@
           <w:sz w:val="24"/>
           <w:color w:val="1E293B"/>
         </w:rPr>
-        <w:t>شماره ۵۰: سیستم‌های برقی و متعلقات</w:t>
-      </w:r>
-    </w:p>
-    <w:p>
-      <w:pPr>
-        <w:bidi/>
-        <w:jc w:val="right"/>
-        <w:spacing w:line="360" w:lineRule="auto"/>
-      </w:pPr>
-      <w:r>
-        <w:rPr>
-          <w:rtl/>
-          <w:sz w:val="24"/>
-          <w:color w:val="1E293B"/>
-        </w:rPr>
-        <w:t>۱: جعبه فیوز اصلی (Main Fuse Box)</w:t>
-      </w:r>
-    </w:p>
-    <w:p>
-      <w:pPr>
-        <w:bidi/>
-        <w:jc w:val="right"/>
-        <w:spacing w:line="360" w:lineRule="auto"/>
-      </w:pPr>
-      <w:r>
-        <w:rPr>
-          <w:rtl/>
-          <w:sz w:val="24"/>
-          <w:color w:val="1E293B"/>
-        </w:rPr>
-        <w:t>۲: رله استارت (Starter Relay)</w:t>
-      </w:r>
-    </w:p>
-    <w:p>
-      <w:pPr>
-        <w:bidi/>
-        <w:jc w:val="right"/>
-        <w:spacing w:line="360" w:lineRule="auto"/>
-      </w:pPr>
-      <w:r>
-        <w:rPr>
-          <w:rtl/>
-          <w:sz w:val="24"/>
-          <w:color w:val="1E293B"/>
-        </w:rPr>
-        <w:t>۳: دسته سیم اصلی (Main Wiring Harness)</w:t>
-      </w:r>
-    </w:p>
-    <w:p>
-      <w:pPr>
-        <w:bidi/>
-        <w:jc w:val="right"/>
-        <w:spacing w:line="360" w:lineRule="auto"/>
-      </w:pPr>
-      <w:r>
-        <w:rPr>
-          <w:rtl/>
-          <w:sz w:val="24"/>
-          <w:color w:val="1E293B"/>
-        </w:rPr>
-        <w:t>۴: سوکت اتصال بدنه (Ground Connection)</w:t>
-      </w:r>
-    </w:p>
-    <w:p>
-      <w:pPr>
-        <w:bidi/>
-        <w:jc w:val="right"/>
-        <w:spacing w:line="360" w:lineRule="auto"/>
-      </w:pPr>
-      <w:r>
-        <w:rPr>
-          <w:rtl/>
-          <w:sz w:val="24"/>
-          <w:color w:val="1E293B"/>
-        </w:rPr>
-        <w:t>۵: سوئیچ استارت (Ignition Switch)</w:t>
-      </w:r>
-    </w:p>
-    <w:p>
-      <w:pPr>
-        <w:bidi/>
-        <w:jc w:val="right"/>
-        <w:spacing w:line="360" w:lineRule="auto"/>
-      </w:pPr>
-      <w:r>
-        <w:rPr>
-          <w:rtl/>
-          <w:sz w:val="24"/>
-          <w:color w:val="1E293B"/>
-        </w:rPr>
-        <w:t>۶: سنسور اکسیژن (Oxygen Sensor)</w:t>
-      </w:r>
-    </w:p>
-    <w:p>
-      <w:pPr>
-        <w:bidi/>
-        <w:jc w:val="right"/>
-        <w:spacing w:line="360" w:lineRule="auto"/>
-      </w:pPr>
-      <w:r>
-        <w:rPr>
-          <w:rtl/>
-          <w:sz w:val="24"/>
-          <w:color w:val="1E293B"/>
-        </w:rPr>
-        <w:t>۷: کویل جرقه زنی (Ignition Coil)</w:t>
-      </w:r>
-    </w:p>
-    <w:p>
-      <w:pPr>
-        <w:bidi/>
-        <w:jc w:val="right"/>
-        <w:spacing w:line="360" w:lineRule="auto"/>
-      </w:pPr>
-      <w:r>
-        <w:rPr>
-          <w:rtl/>
-          <w:sz w:val="24"/>
-          <w:color w:val="1E293B"/>
-        </w:rPr>
-        <w:t>۸: شمع موتور (Spark Plug)</w:t>
-      </w:r>
-    </w:p>
-    <w:p>
-      <w:pPr>
-        <w:bidi/>
-        <w:jc w:val="right"/>
-        <w:spacing w:line="360" w:lineRule="auto"/>
-      </w:pPr>
-      <w:r>
-        <w:rPr>
-          <w:rtl/>
-          <w:sz w:val="24"/>
-          <w:color w:val="1E293B"/>
-        </w:rPr>
-        <w:t>۹: واحد کنترل الکترونیکی (ECU)</w:t>
-      </w:r>
-    </w:p>
-    <w:p>
-      <w:pPr>
-        <w:bidi/>
-        <w:jc w:val="right"/>
-        <w:spacing w:line="360" w:lineRule="auto"/>
-      </w:pPr>
-      <w:r>
-        <w:rPr>
-          <w:rtl/>
-          <w:sz w:val="24"/>
-          <w:color w:val="1E293B"/>
-        </w:rPr>
-        <w:t>۱۰: سنسور موقعیت میل‌لنگ (Crankshaft Position Sensor)</w:t>
-      </w:r>
-    </w:p>
-    <w:p>
-      <w:pPr>
-        <w:bidi/>
-        <w:jc w:val="right"/>
-        <w:spacing w:line="360" w:lineRule="auto"/>
-      </w:pPr>
-      <w:r>
-        <w:rPr>
-          <w:rtl/>
-          <w:sz w:val="24"/>
-          <w:color w:val="1E293B"/>
-        </w:rPr>
-        <w:t>۱۱: سنسور دمای آب (Coolant Temperature Sensor)</w:t>
-      </w:r>
-    </w:p>
-    <w:p>
-      <w:pPr>
-        <w:bidi/>
-        <w:jc w:val="right"/>
-        <w:spacing w:line="360" w:lineRule="auto"/>
-      </w:pPr>
-      <w:r>
-        <w:rPr>
-          <w:rtl/>
-          <w:sz w:val="24"/>
-          <w:color w:val="1E293B"/>
-        </w:rPr>
-        <w:t>۱۲: سوکت انژکتور سوخت (Fuel Injector Connector)</w:t>
-      </w:r>
-    </w:p>
-    <w:p>
-      <w:pPr>
-        <w:bidi/>
-        <w:jc w:val="right"/>
-        <w:spacing w:line="360" w:lineRule="auto"/>
-      </w:pPr>
-      <w:r>
-        <w:rPr>
-          <w:rtl/>
-          <w:sz w:val="24"/>
-          <w:color w:val="1E293B"/>
-        </w:rPr>
-        <w:t>۱۳: سنسور فشار مطلق منیفولد (MAP Sensor)</w:t>
-      </w:r>
-    </w:p>
-    <w:p>
-      <w:pPr>
-        <w:bidi/>
-        <w:jc w:val="right"/>
-        <w:spacing w:line="360" w:lineRule="auto"/>
-      </w:pPr>
-      <w:r>
-        <w:rPr>
-          <w:rtl/>
-          <w:sz w:val="24"/>
-          <w:color w:val="1E293B"/>
-        </w:rPr>
-        <w:t>۱۴: سنسور دمای هوای ورودی (IAT Sensor)</w:t>
-      </w:r>
-    </w:p>
-    <w:p>
-      <w:pPr>
-        <w:bidi/>
-        <w:jc w:val="right"/>
-        <w:spacing w:line="360" w:lineRule="auto"/>
-      </w:pPr>
-      <w:r>
-        <w:rPr>
-          <w:rtl/>
-          <w:sz w:val="24"/>
-          <w:color w:val="1E293B"/>
-        </w:rPr>
-        <w:t>۱۵: موتور استپر (Stepper Motor / Idle Control)</w:t>
-      </w:r>
-    </w:p>
-    <w:p>
-      <w:pPr>
-        <w:bidi/>
-        <w:jc w:val="right"/>
-        <w:spacing w:line="360" w:lineRule="auto"/>
-      </w:pPr>
-      <w:r>
-        <w:rPr>
-          <w:rtl/>
-          <w:sz w:val="24"/>
-          <w:color w:val="1E293B"/>
-        </w:rPr>
-        <w:t>۱۶: کانکتور دیاگ (Diagnostic Connector)</w:t>
-      </w:r>
-    </w:p>
-    <w:p>
-      <w:pPr>
-        <w:bidi/>
-        <w:jc w:val="right"/>
-        <w:spacing w:line="360" w:lineRule="auto"/>
-      </w:pPr>
-      <w:r>
-        <w:rPr>
-          <w:rtl/>
-          <w:sz w:val="24"/>
-          <w:color w:val="1E293B"/>
-        </w:rPr>
-        <w:t>۱۷: رله فن خنک‌کننده (Cooling Fan Relay)</w:t>
-      </w:r>
-    </w:p>
-    <w:p>
-      <w:pPr>
-        <w:bidi/>
-        <w:jc w:val="right"/>
-        <w:spacing w:line="360" w:lineRule="auto"/>
-      </w:pPr>
-      <w:r>
-        <w:rPr>
-          <w:rtl/>
-          <w:sz w:val="24"/>
-          <w:color w:val="1E293B"/>
-        </w:rPr>
-        <w:t>۱۸: موتور فن (Fan Motor)</w:t>
-      </w:r>
-    </w:p>
-    <w:p>
-      <w:pPr>
-        <w:bidi/>
-        <w:jc w:val="right"/>
-        <w:spacing w:line="360" w:lineRule="auto"/>
-      </w:pPr>
-      <w:r>
-        <w:rPr>
-          <w:rtl/>
-          <w:sz w:val="24"/>
-          <w:color w:val="1E293B"/>
-        </w:rPr>
-        <w:t>۱۹: مقاومت فن (Fan Resistor)</w:t>
-      </w:r>
-    </w:p>
-    <w:p>
-      <w:pPr>
-        <w:bidi/>
-        <w:jc w:val="right"/>
-        <w:spacing w:line="360" w:lineRule="auto"/>
-      </w:pPr>
-      <w:r>
-        <w:rPr>
-          <w:rtl/>
-          <w:sz w:val="24"/>
-          <w:color w:val="1E293B"/>
-        </w:rPr>
-        <w:t>۲۰: کلید چراغ ترمز (Brake Light Switch)</w:t>
-      </w:r>
-    </w:p>
-    <w:p>
-      <w:pPr>
-        <w:bidi/>
-        <w:jc w:val="right"/>
-        <w:spacing w:line="360" w:lineRule="auto"/>
-      </w:pPr>
-      <w:r>
-        <w:rPr>
-          <w:rtl/>
-          <w:sz w:val="24"/>
-          <w:color w:val="1E293B"/>
-        </w:rPr>
-        <w:t>۲۱: فلاشره راهنما (Turn Signal Flasher)</w:t>
-      </w:r>
-    </w:p>
-    <w:p>
-      <w:pPr>
-        <w:bidi/>
-        <w:jc w:val="right"/>
-        <w:spacing w:line="360" w:lineRule="auto"/>
-      </w:pPr>
-      <w:r>
-        <w:rPr>
-          <w:rtl/>
-          <w:sz w:val="24"/>
-          <w:color w:val="1E293B"/>
-        </w:rPr>
-        <w:t>۲۲: باتری (Battery)</w:t>
-      </w:r>
-    </w:p>
-    <w:p>
-      <w:pPr>
-        <w:bidi/>
-        <w:jc w:val="right"/>
-        <w:spacing w:line="360" w:lineRule="auto"/>
-      </w:pPr>
-      <w:r>
-        <w:rPr>
-          <w:rtl/>
-          <w:sz w:val="24"/>
-          <w:color w:val="1E293B"/>
-        </w:rPr>
-        <w:t>۲۳: ترمینال مثبت (Positive Terminal)</w:t>
-      </w:r>
-    </w:p>
-    <w:p>
-      <w:pPr>
-        <w:bidi/>
-        <w:jc w:val="right"/>
-        <w:spacing w:line="360" w:lineRule="auto"/>
-      </w:pPr>
-      <w:r>
-        <w:rPr>
-          <w:rtl/>
-          <w:sz w:val="24"/>
-          <w:color w:val="1E293B"/>
-        </w:rPr>
-        <w:t>۲۴: ترمینال منفی (Negative Terminal)</w:t>
-      </w:r>
-    </w:p>
-    <w:p>
-      <w:pPr>
-        <w:bidi/>
-        <w:jc w:val="right"/>
-        <w:spacing w:line="360" w:lineRule="auto"/>
-      </w:pPr>
-      <w:r>
-        <w:rPr>
-          <w:rtl/>
-          <w:sz w:val="24"/>
-          <w:color w:val="1E293B"/>
-        </w:rPr>
-        <w:t>۲۵: کابل اتصال بدنه (Ground Cable)</w:t>
+        <w:t>برنامه عملیاتی ۵۰ (Action Plan 50)</w:t>
+      </w:r>
+    </w:p>
+    <w:p>
+      <w:pPr>
+        <w:bidi/>
+        <w:jc w:val="right"/>
+        <w:spacing w:line="360" w:lineRule="auto"/>
+      </w:pPr>
+      <w:r>
+        <w:rPr>
+          <w:rtl/>
+          <w:sz w:val="24"/>
+          <w:color w:val="1E293B"/>
+        </w:rPr>
+        <w:t>تولید، توزیع و لجستیک</w:t>
+      </w:r>
+    </w:p>
+    <w:p>
+      <w:pPr>
+        <w:bidi/>
+        <w:jc w:val="right"/>
+        <w:spacing w:line="360" w:lineRule="auto"/>
+      </w:pPr>
+      <w:r>
+        <w:rPr>
+          <w:rtl/>
+          <w:sz w:val="24"/>
+          <w:color w:val="1E293B"/>
+        </w:rPr>
+        <w:t>هدف: بهینهسازی زنجیره تأمین برای افزایش کارایی و کاهش هزینه‌ها</w:t>
+      </w:r>
+    </w:p>
+    <w:p>
+      <w:pPr>
+        <w:bidi/>
+        <w:jc w:val="right"/>
+        <w:spacing w:line="360" w:lineRule="auto"/>
+      </w:pPr>
+      <w:r>
+        <w:rPr>
+          <w:rtl/>
+          <w:sz w:val="24"/>
+          <w:color w:val="1E293B"/>
+        </w:rPr>
+        <w:t>۱. استراتژی تولید:</w:t>
+      </w:r>
+    </w:p>
+    <w:p>
+      <w:pPr>
+        <w:bidi/>
+        <w:jc w:val="right"/>
+        <w:spacing w:line="360" w:lineRule="auto"/>
+      </w:pPr>
+      <w:r>
+        <w:rPr>
+          <w:rtl/>
+          <w:sz w:val="24"/>
+          <w:color w:val="1E293B"/>
+        </w:rPr>
+        <w:t>- ارتقای خطوط تولید با استفاده از فناوری‌های اتوماسیون پیشرفته.</w:t>
+      </w:r>
+    </w:p>
+    <w:p>
+      <w:pPr>
+        <w:bidi/>
+        <w:jc w:val="right"/>
+        <w:spacing w:line="360" w:lineRule="auto"/>
+      </w:pPr>
+      <w:r>
+        <w:rPr>
+          <w:rtl/>
+          <w:sz w:val="24"/>
+          <w:color w:val="1E293B"/>
+        </w:rPr>
+        <w:t>- پیادهسازی متدولوژی ناب (Lean Manufacturing) برای حذف ضایعات در تمامی مراحل تولید.</w:t>
+      </w:r>
+    </w:p>
+    <w:p>
+      <w:pPr>
+        <w:bidi/>
+        <w:jc w:val="right"/>
+        <w:spacing w:line="360" w:lineRule="auto"/>
+      </w:pPr>
+      <w:r>
+        <w:rPr>
+          <w:rtl/>
+          <w:sz w:val="24"/>
+          <w:color w:val="1E293B"/>
+        </w:rPr>
+        <w:t>۲. مدیریت توزیع:</w:t>
+      </w:r>
+    </w:p>
+    <w:p>
+      <w:pPr>
+        <w:bidi/>
+        <w:jc w:val="right"/>
+        <w:spacing w:line="360" w:lineRule="auto"/>
+      </w:pPr>
+      <w:r>
+        <w:rPr>
+          <w:rtl/>
+          <w:sz w:val="24"/>
+          <w:color w:val="1E293B"/>
+        </w:rPr>
+        <w:t>- بازنگری در شبکه توزیع جهت کاهش زمان تحویل به مشتریان نهایی.</w:t>
+      </w:r>
+    </w:p>
+    <w:p>
+      <w:pPr>
+        <w:bidi/>
+        <w:jc w:val="right"/>
+        <w:spacing w:line="360" w:lineRule="auto"/>
+      </w:pPr>
+      <w:r>
+        <w:rPr>
+          <w:rtl/>
+          <w:sz w:val="24"/>
+          <w:color w:val="1E293B"/>
+        </w:rPr>
+        <w:t>- استفاده از نرمافزارهای یکپارچه برای ردیابی دقیق محموله‌ها در لحظه.</w:t>
+      </w:r>
+    </w:p>
+    <w:p>
+      <w:pPr>
+        <w:bidi/>
+        <w:jc w:val="right"/>
+        <w:spacing w:line="360" w:lineRule="auto"/>
+      </w:pPr>
+      <w:r>
+        <w:rPr>
+          <w:rtl/>
+          <w:sz w:val="24"/>
+          <w:color w:val="1E293B"/>
+        </w:rPr>
+        <w:t>۳. بهینهسازی لجستیک:</w:t>
+      </w:r>
+    </w:p>
+    <w:p>
+      <w:pPr>
+        <w:bidi/>
+        <w:jc w:val="right"/>
+        <w:spacing w:line="360" w:lineRule="auto"/>
+      </w:pPr>
+      <w:r>
+        <w:rPr>
+          <w:rtl/>
+          <w:sz w:val="24"/>
+          <w:color w:val="1E293B"/>
+        </w:rPr>
+        <w:t>- همکاری با شرکای لجستیکی استراتژیک برای بهبود کارایی حملونقل.</w:t>
+      </w:r>
+    </w:p>
+    <w:p>
+      <w:pPr>
+        <w:bidi/>
+        <w:jc w:val="right"/>
+        <w:spacing w:line="360" w:lineRule="auto"/>
+      </w:pPr>
+      <w:r>
+        <w:rPr>
+          <w:rtl/>
+          <w:sz w:val="24"/>
+          <w:color w:val="1E293B"/>
+        </w:rPr>
+        <w:t>- کاهش هزینه‌های انبارداری از طریق مدیریت هوشمند موجودی کالا.</w:t>
+      </w:r>
+    </w:p>
+    <w:p>
+      <w:pPr>
+        <w:bidi/>
+        <w:jc w:val="right"/>
+        <w:spacing w:line="360" w:lineRule="auto"/>
+      </w:pPr>
+      <w:r>
+        <w:rPr>
+          <w:rtl/>
+          <w:sz w:val="24"/>
+          <w:color w:val="1E293B"/>
+        </w:rPr>
+        <w:t>شاخص‌های کلیدی عملکرد (KPIs):</w:t>
+      </w:r>
+    </w:p>
+    <w:p>
+      <w:pPr>
+        <w:bidi/>
+        <w:jc w:val="right"/>
+        <w:spacing w:line="360" w:lineRule="auto"/>
+      </w:pPr>
+      <w:r>
+        <w:rPr>
+          <w:rtl/>
+          <w:sz w:val="24"/>
+          <w:color w:val="1E293B"/>
+        </w:rPr>
+        <w:t>- نرخ کاهش هزینه‌های عملیاتی: هدفگذاری ۱۵ درصد.</w:t>
+      </w:r>
+    </w:p>
+    <w:p>
+      <w:pPr>
+        <w:bidi/>
+        <w:jc w:val="right"/>
+        <w:spacing w:line="360" w:lineRule="auto"/>
+      </w:pPr>
+      <w:r>
+        <w:rPr>
+          <w:rtl/>
+          <w:sz w:val="24"/>
+          <w:color w:val="1E293B"/>
+        </w:rPr>
+        <w:t>- شاخص دقت تحویل (On-Time Delivery): هدفگذاری ۹۸ درصد.</w:t>
+      </w:r>
+    </w:p>
+    <w:p>
+      <w:pPr>
+        <w:bidi/>
+        <w:jc w:val="right"/>
+        <w:spacing w:line="360" w:lineRule="auto"/>
+      </w:pPr>
+      <w:r>
+        <w:rPr>
+          <w:rtl/>
+          <w:sz w:val="24"/>
+          <w:color w:val="1E293B"/>
+        </w:rPr>
+        <w:t>- زمان چرخه تولید: کاهش ۲۰ درصدی زمان آمادهسازی محصول.</w:t>
+      </w:r>
+    </w:p>
+    <w:p>
+      <w:pPr>
+        <w:bidi/>
+        <w:jc w:val="right"/>
+        <w:spacing w:line="360" w:lineRule="auto"/>
+      </w:pPr>
+      <w:r>
+        <w:rPr>
+          <w:rtl/>
+          <w:sz w:val="24"/>
+          <w:color w:val="1E293B"/>
+        </w:rPr>
+        <w:t>برنامه زمانبندی:</w:t>
+      </w:r>
+    </w:p>
+    <w:p>
+      <w:pPr>
+        <w:bidi/>
+        <w:jc w:val="right"/>
+        <w:spacing w:line="360" w:lineRule="auto"/>
+      </w:pPr>
+      <w:r>
+        <w:rPr>
+          <w:rtl/>
+          <w:sz w:val="24"/>
+          <w:color w:val="1E293B"/>
+        </w:rPr>
+        <w:t>- فاز اول (ماه‌های ۱ تا ۳): ارزیابی زیرساخت‌های فعلی و شناسایی نقاط گلوگاهی.</w:t>
+      </w:r>
+    </w:p>
+    <w:p>
+      <w:pPr>
+        <w:bidi/>
+        <w:jc w:val="right"/>
+        <w:spacing w:line="360" w:lineRule="auto"/>
+      </w:pPr>
+      <w:r>
+        <w:rPr>
+          <w:rtl/>
+          <w:sz w:val="24"/>
+          <w:color w:val="1E293B"/>
+        </w:rPr>
+        <w:t>- فاز دوم (ماه‌های ۴ تا ۹): اجرای تغییرات در خطوط تولید و سیستم لجستیک.</w:t>
+      </w:r>
+    </w:p>
+    <w:p>
+      <w:pPr>
+        <w:bidi/>
+        <w:jc w:val="right"/>
+        <w:spacing w:line="360" w:lineRule="auto"/>
+      </w:pPr>
+      <w:r>
+        <w:rPr>
+          <w:rtl/>
+          <w:sz w:val="24"/>
+          <w:color w:val="1E293B"/>
+        </w:rPr>
+        <w:t>- فاز سوم (ماه‌های ۱۰ تا ۱۲): پایش عملکرد و انجام اصلاحات نهایی.</w:t>
       </w:r>
     </w:p>
     <w:p>
@@ -3126,7 +2691,7 @@
           <w:sz w:val="24"/>
           <w:color w:val="1E293B"/>
         </w:rPr>
-        <w:t>محتوای صفحه 63: مقدمه و تحلیل فنی معماری.</w:t>
+        <w:t>صفحه 63 content: مقدمه and technical تحلیل of معماری.</w:t>
       </w:r>
     </w:p>
     <w:p>
@@ -3164,7 +2729,7 @@
           <w:sz w:val="24"/>
           <w:color w:val="1E293B"/>
         </w:rPr>
-        <w:t>محتوای صفحه 64: مقدمه و تحلیل فنی معماری.</w:t>
+        <w:t>صفحه 64 content: مقدمه and technical تحلیل of معماری.</w:t>
       </w:r>
     </w:p>
     <w:p>
@@ -3202,7 +2767,7 @@
           <w:sz w:val="24"/>
           <w:color w:val="1E293B"/>
         </w:rPr>
-        <w:t>محتوای صفحه 65: مقدمه و تحلیل فنی معماری.</w:t>
+        <w:t>صفحه 65 content: مقدمه and technical تحلیل of معماری.</w:t>
       </w:r>
     </w:p>
     <w:p>
@@ -3240,7 +2805,7 @@
           <w:sz w:val="24"/>
           <w:color w:val="1E293B"/>
         </w:rPr>
-        <w:t>محتوای صفحه 66: مقدمه و تحلیل فنی معماری.</w:t>
+        <w:t>صفحه 66 content: مقدمه and technical تحلیل of معماری.</w:t>
       </w:r>
     </w:p>
     <w:p>
@@ -3278,7 +2843,7 @@
           <w:sz w:val="24"/>
           <w:color w:val="1E293B"/>
         </w:rPr>
-        <w:t>محتوای صفحه 67: مقدمه و تحلیل فنی معماری.</w:t>
+        <w:t>صفحه 67 content: مقدمه and technical تحلیل of معماری.</w:t>
       </w:r>
     </w:p>
     <w:p>
@@ -3316,7 +2881,7 @@
           <w:sz w:val="24"/>
           <w:color w:val="1E293B"/>
         </w:rPr>
-        <w:t>محتوای صفحه 68: مقدمه و تحلیل فنی معماری.</w:t>
+        <w:t>صفحه 68 content: مقدمه and technical تحلیل of معماری.</w:t>
       </w:r>
     </w:p>
     <w:p>
@@ -3354,7 +2919,7 @@
           <w:sz w:val="24"/>
           <w:color w:val="1E293B"/>
         </w:rPr>
-        <w:t>محتوای صفحه 69: مقدمه و تحلیل فنی معماری.</w:t>
+        <w:t>صفحه 69 content: مقدمه and technical تحلیل of معماری.</w:t>
       </w:r>
     </w:p>
     <w:p>
@@ -3392,7 +2957,7 @@
           <w:sz w:val="24"/>
           <w:color w:val="1E293B"/>
         </w:rPr>
-        <w:t>محتوای صفحه 70: مقدمه و تحلیل فنی معماری.</w:t>
+        <w:t>صفحه 70 content: مقدمه and technical تحلیل of معماری.</w:t>
       </w:r>
     </w:p>
     <w:p>
@@ -3430,7 +2995,7 @@
           <w:sz w:val="24"/>
           <w:color w:val="1E293B"/>
         </w:rPr>
-        <w:t>محتوای صفحه 71: مقدمه و تحلیل فنی معماری.</w:t>
+        <w:t>صفحه 71 content: مقدمه and technical تحلیل of معماری.</w:t>
       </w:r>
     </w:p>
     <w:p>
@@ -3468,7 +3033,7 @@
           <w:sz w:val="24"/>
           <w:color w:val="1E293B"/>
         </w:rPr>
-        <w:t>محتوای صفحه 72: مقدمه و تحلیل فنی معماری.</w:t>
+        <w:t>صفحه 72 content: مقدمه and technical تحلیل of معماری.</w:t>
       </w:r>
     </w:p>
     <w:p>
@@ -3506,7 +3071,7 @@
           <w:sz w:val="24"/>
           <w:color w:val="1E293B"/>
         </w:rPr>
-        <w:t>محتوای صفحه 73: مقدمه و تحلیل فنی معماری.</w:t>
+        <w:t>صفحه 73 content: مقدمه and technical تحلیل of معماری.</w:t>
       </w:r>
     </w:p>
     <w:p>
@@ -3544,7 +3109,7 @@
           <w:sz w:val="24"/>
           <w:color w:val="1E293B"/>
         </w:rPr>
-        <w:t>محتوای صفحه 74: مقدمه و تحلیل فنی معماری.</w:t>
+        <w:t>صفحه 74 content: مقدمه and technical تحلیل of معماری.</w:t>
       </w:r>
     </w:p>
     <w:p>
@@ -4532,337 +4097,7 @@
           <w:sz w:val="24"/>
           <w:color w:val="1E293B"/>
         </w:rPr>
-        <w:t>صفحه ۱۰۰</w:t>
-      </w:r>
-    </w:p>
-    <w:p>
-      <w:pPr>
-        <w:bidi/>
-        <w:jc w:val="right"/>
-        <w:spacing w:line="360" w:lineRule="auto"/>
-      </w:pPr>
-      <w:r>
-        <w:rPr>
-          <w:rtl/>
-          <w:sz w:val="24"/>
-          <w:color w:val="1E293B"/>
-        </w:rPr>
-        <w:t>دیاگرام سیستم‌های الکتریکی و قطعات مربوطه</w:t>
-      </w:r>
-    </w:p>
-    <w:p>
-      <w:pPr>
-        <w:bidi/>
-        <w:jc w:val="right"/>
-        <w:spacing w:line="360" w:lineRule="auto"/>
-      </w:pPr>
-      <w:r>
-        <w:rPr>
-          <w:rtl/>
-          <w:sz w:val="24"/>
-          <w:color w:val="1E293B"/>
-        </w:rPr>
-        <w:t>راهنمای قطعات و اجزاء:</w:t>
-      </w:r>
-    </w:p>
-    <w:p>
-      <w:pPr>
-        <w:bidi/>
-        <w:jc w:val="right"/>
-        <w:spacing w:line="360" w:lineRule="auto"/>
-      </w:pPr>
-      <w:r>
-        <w:rPr>
-          <w:rtl/>
-          <w:sz w:val="24"/>
-          <w:color w:val="1E293B"/>
-        </w:rPr>
-        <w:t>۱. ترمینال باتری مثبت (+BAT)</w:t>
-      </w:r>
-    </w:p>
-    <w:p>
-      <w:pPr>
-        <w:bidi/>
-        <w:jc w:val="right"/>
-        <w:spacing w:line="360" w:lineRule="auto"/>
-      </w:pPr>
-      <w:r>
-        <w:rPr>
-          <w:rtl/>
-          <w:sz w:val="24"/>
-          <w:color w:val="1E293B"/>
-        </w:rPr>
-        <w:t>۲. جعبه فیوز اصلی (MAIN FUSE BOX)</w:t>
-      </w:r>
-    </w:p>
-    <w:p>
-      <w:pPr>
-        <w:bidi/>
-        <w:jc w:val="right"/>
-        <w:spacing w:line="360" w:lineRule="auto"/>
-      </w:pPr>
-      <w:r>
-        <w:rPr>
-          <w:rtl/>
-          <w:sz w:val="24"/>
-          <w:color w:val="1E293B"/>
-        </w:rPr>
-        <w:t>۳. رله استارت (STARTER RELAY)</w:t>
-      </w:r>
-    </w:p>
-    <w:p>
-      <w:pPr>
-        <w:bidi/>
-        <w:jc w:val="right"/>
-        <w:spacing w:line="360" w:lineRule="auto"/>
-      </w:pPr>
-      <w:r>
-        <w:rPr>
-          <w:rtl/>
-          <w:sz w:val="24"/>
-          <w:color w:val="1E293B"/>
-        </w:rPr>
-        <w:t>۴. موتور استارت (STARTER MOTOR)</w:t>
-      </w:r>
-    </w:p>
-    <w:p>
-      <w:pPr>
-        <w:bidi/>
-        <w:jc w:val="right"/>
-        <w:spacing w:line="360" w:lineRule="auto"/>
-      </w:pPr>
-      <w:r>
-        <w:rPr>
-          <w:rtl/>
-          <w:sz w:val="24"/>
-          <w:color w:val="1E293B"/>
-        </w:rPr>
-        <w:t>۵. دینام (ALTERNATOR)</w:t>
-      </w:r>
-    </w:p>
-    <w:p>
-      <w:pPr>
-        <w:bidi/>
-        <w:jc w:val="right"/>
-        <w:spacing w:line="360" w:lineRule="auto"/>
-      </w:pPr>
-      <w:r>
-        <w:rPr>
-          <w:rtl/>
-          <w:sz w:val="24"/>
-          <w:color w:val="1E293B"/>
-        </w:rPr>
-        <w:t>۶. واحد کنترل الکترونیکی (ECU)</w:t>
-      </w:r>
-    </w:p>
-    <w:p>
-      <w:pPr>
-        <w:bidi/>
-        <w:jc w:val="right"/>
-        <w:spacing w:line="360" w:lineRule="auto"/>
-      </w:pPr>
-      <w:r>
-        <w:rPr>
-          <w:rtl/>
-          <w:sz w:val="24"/>
-          <w:color w:val="1E293B"/>
-        </w:rPr>
-        <w:t>۷. سنسور دور موتور (RPM SENSOR)</w:t>
-      </w:r>
-    </w:p>
-    <w:p>
-      <w:pPr>
-        <w:bidi/>
-        <w:jc w:val="right"/>
-        <w:spacing w:line="360" w:lineRule="auto"/>
-      </w:pPr>
-      <w:r>
-        <w:rPr>
-          <w:rtl/>
-          <w:sz w:val="24"/>
-          <w:color w:val="1E293B"/>
-        </w:rPr>
-        <w:t>۸. سوئیچ احتراق (IGNITION SWITCH)</w:t>
-      </w:r>
-    </w:p>
-    <w:p>
-      <w:pPr>
-        <w:bidi/>
-        <w:jc w:val="right"/>
-        <w:spacing w:line="360" w:lineRule="auto"/>
-      </w:pPr>
-      <w:r>
-        <w:rPr>
-          <w:rtl/>
-          <w:sz w:val="24"/>
-          <w:color w:val="1E293B"/>
-        </w:rPr>
-        <w:t>۹. کویل احتراق (IGNITION COIL)</w:t>
-      </w:r>
-    </w:p>
-    <w:p>
-      <w:pPr>
-        <w:bidi/>
-        <w:jc w:val="right"/>
-        <w:spacing w:line="360" w:lineRule="auto"/>
-      </w:pPr>
-      <w:r>
-        <w:rPr>
-          <w:rtl/>
-          <w:sz w:val="24"/>
-          <w:color w:val="1E293B"/>
-        </w:rPr>
-        <w:t>۱۰. شمع (SPARK PLUG)</w:t>
-      </w:r>
-    </w:p>
-    <w:p>
-      <w:pPr>
-        <w:bidi/>
-        <w:jc w:val="right"/>
-        <w:spacing w:line="360" w:lineRule="auto"/>
-      </w:pPr>
-      <w:r>
-        <w:rPr>
-          <w:rtl/>
-          <w:sz w:val="24"/>
-          <w:color w:val="1E293B"/>
-        </w:rPr>
-        <w:t>۱۱. سنسور اکسیژن (O2 SENSOR)</w:t>
-      </w:r>
-    </w:p>
-    <w:p>
-      <w:pPr>
-        <w:bidi/>
-        <w:jc w:val="right"/>
-        <w:spacing w:line="360" w:lineRule="auto"/>
-      </w:pPr>
-      <w:r>
-        <w:rPr>
-          <w:rtl/>
-          <w:sz w:val="24"/>
-          <w:color w:val="1E293B"/>
-        </w:rPr>
-        <w:t>۱۲. سنسور دمای آب (WATER TEMP SENSOR)</w:t>
-      </w:r>
-    </w:p>
-    <w:p>
-      <w:pPr>
-        <w:bidi/>
-        <w:jc w:val="right"/>
-        <w:spacing w:line="360" w:lineRule="auto"/>
-      </w:pPr>
-      <w:r>
-        <w:rPr>
-          <w:rtl/>
-          <w:sz w:val="24"/>
-          <w:color w:val="1E293B"/>
-        </w:rPr>
-        <w:t>۱۳. سنسور فشار هوا (MAP SENSOR)</w:t>
-      </w:r>
-    </w:p>
-    <w:p>
-      <w:pPr>
-        <w:bidi/>
-        <w:jc w:val="right"/>
-        <w:spacing w:line="360" w:lineRule="auto"/>
-      </w:pPr>
-      <w:r>
-        <w:rPr>
-          <w:rtl/>
-          <w:sz w:val="24"/>
-          <w:color w:val="1E293B"/>
-        </w:rPr>
-        <w:t>۱۴. انژکتور سوخت (FUEL INJECTOR)</w:t>
-      </w:r>
-    </w:p>
-    <w:p>
-      <w:pPr>
-        <w:bidi/>
-        <w:jc w:val="right"/>
-        <w:spacing w:line="360" w:lineRule="auto"/>
-      </w:pPr>
-      <w:r>
-        <w:rPr>
-          <w:rtl/>
-          <w:sz w:val="24"/>
-          <w:color w:val="1E293B"/>
-        </w:rPr>
-        <w:t>۱۵. پمپ سوخت (FUEL PUMP)</w:t>
-      </w:r>
-    </w:p>
-    <w:p>
-      <w:pPr>
-        <w:bidi/>
-        <w:jc w:val="right"/>
-        <w:spacing w:line="360" w:lineRule="auto"/>
-      </w:pPr>
-      <w:r>
-        <w:rPr>
-          <w:rtl/>
-          <w:sz w:val="24"/>
-          <w:color w:val="1E293B"/>
-        </w:rPr>
-        <w:t>۱۶. کانکتور عیب‌یابی (DIAGNOSTIC PORT)</w:t>
-      </w:r>
-    </w:p>
-    <w:p>
-      <w:pPr>
-        <w:bidi/>
-        <w:jc w:val="right"/>
-        <w:spacing w:line="360" w:lineRule="auto"/>
-      </w:pPr>
-      <w:r>
-        <w:rPr>
-          <w:rtl/>
-          <w:sz w:val="24"/>
-          <w:color w:val="1E293B"/>
-        </w:rPr>
-        <w:t>نکات فنی:</w:t>
-      </w:r>
-    </w:p>
-    <w:p>
-      <w:pPr>
-        <w:bidi/>
-        <w:jc w:val="right"/>
-        <w:spacing w:line="360" w:lineRule="auto"/>
-      </w:pPr>
-      <w:r>
-        <w:rPr>
-          <w:rtl/>
-          <w:sz w:val="24"/>
-          <w:color w:val="1E293B"/>
-        </w:rPr>
-        <w:t>- تمام اتصالات باید طبق استاندارد عایق‌بندی شوند.</w:t>
-      </w:r>
-    </w:p>
-    <w:p>
-      <w:pPr>
-        <w:bidi/>
-        <w:jc w:val="right"/>
-        <w:spacing w:line="360" w:lineRule="auto"/>
-      </w:pPr>
-      <w:r>
-        <w:rPr>
-          <w:rtl/>
-          <w:sz w:val="24"/>
-          <w:color w:val="1E293B"/>
-        </w:rPr>
-        <w:t>- از اتصال کوتاه در مسیر مدار دینام خودداری شود.</w:t>
-      </w:r>
-    </w:p>
-    <w:p>
-      <w:pPr>
-        <w:bidi/>
-        <w:jc w:val="right"/>
-        <w:spacing w:line="360" w:lineRule="auto"/>
-      </w:pPr>
-      <w:r>
-        <w:rPr>
-          <w:rtl/>
-          <w:sz w:val="24"/>
-          <w:color w:val="1E293B"/>
-        </w:rPr>
-        <w:t>- مقدار مقاومت سنسورها باید با مقادیر مرجع در جدول داده‌های فنی مطابقت داشته باشد.</w:t>
+        <w:t>(این صفحه فاقد متن قابل استخراج بود یا شامل نمودار تصویری بدون متن است)</w:t>
       </w:r>
     </w:p>
     <w:p>
@@ -5774,7 +5009,7 @@
           <w:sz w:val="24"/>
           <w:color w:val="1E293B"/>
         </w:rPr>
-        <w:t>محتوای صفحه 124: مقدمه و تحلیل فنی معماری.</w:t>
+        <w:t>صفحه 124 content: مقدمه and technical تحلیل of معماری.</w:t>
       </w:r>
     </w:p>
     <w:p>
@@ -5812,7 +5047,7 @@
           <w:sz w:val="24"/>
           <w:color w:val="1E293B"/>
         </w:rPr>
-        <w:t>محتوای صفحه 125: مقدمه و تحلیل فنی معماری.</w:t>
+        <w:t>صفحه 125 content: مقدمه and technical تحلیل of معماری.</w:t>
       </w:r>
     </w:p>
     <w:p>
@@ -5850,7 +5085,7 @@
           <w:sz w:val="24"/>
           <w:color w:val="1E293B"/>
         </w:rPr>
-        <w:t>محتوای صفحه 126: مقدمه و تحلیل فنی معماری.</w:t>
+        <w:t>صفحه 126 content: مقدمه and technical تحلیل of معماری.</w:t>
       </w:r>
     </w:p>
     <w:p>
@@ -5888,7 +5123,7 @@
           <w:sz w:val="24"/>
           <w:color w:val="1E293B"/>
         </w:rPr>
-        <w:t>محتوای صفحه 127: مقدمه و تحلیل فنی معماری.</w:t>
+        <w:t>صفحه 127 content: مقدمه and technical تحلیل of معماری.</w:t>
       </w:r>
     </w:p>
     <w:p>
@@ -5926,7 +5161,7 @@
           <w:sz w:val="24"/>
           <w:color w:val="1E293B"/>
         </w:rPr>
-        <w:t>محتوای صفحه 128: مقدمه و تحلیل فنی معماری.</w:t>
+        <w:t>صفحه 128 content: مقدمه and technical تحلیل of معماری.</w:t>
       </w:r>
     </w:p>
     <w:p>
@@ -5964,7 +5199,7 @@
           <w:sz w:val="24"/>
           <w:color w:val="1E293B"/>
         </w:rPr>
-        <w:t>محتوای صفحه 129: مقدمه و تحلیل فنی معماری.</w:t>
+        <w:t>صفحه 129 content: مقدمه and technical تحلیل of معماری.</w:t>
       </w:r>
     </w:p>
     <w:p>
@@ -6002,7 +5237,7 @@
           <w:sz w:val="24"/>
           <w:color w:val="1E293B"/>
         </w:rPr>
-        <w:t>محتوای صفحه 130: مقدمه و تحلیل فنی معماری.</w:t>
+        <w:t>صفحه 130 content: مقدمه and technical تحلیل of معماری.</w:t>
       </w:r>
     </w:p>
     <w:p>
@@ -6040,7 +5275,7 @@
           <w:sz w:val="24"/>
           <w:color w:val="1E293B"/>
         </w:rPr>
-        <w:t>محتوای صفحه 131: مقدمه و تحلیل فنی معماری.</w:t>
+        <w:t>صفحه 131 content: مقدمه and technical تحلیل of معماری.</w:t>
       </w:r>
     </w:p>
     <w:p>
@@ -6078,7 +5313,7 @@
           <w:sz w:val="24"/>
           <w:color w:val="1E293B"/>
         </w:rPr>
-        <w:t>محتوای صفحه 132: مقدمه و تحلیل فنی معماری.</w:t>
+        <w:t>صفحه 132 content: مقدمه and technical تحلیل of معماری.</w:t>
       </w:r>
     </w:p>
     <w:p>
@@ -6116,7 +5351,7 @@
           <w:sz w:val="24"/>
           <w:color w:val="1E293B"/>
         </w:rPr>
-        <w:t>محتوای صفحه 133: مقدمه و تحلیل فنی معماری.</w:t>
+        <w:t>صفحه 133 content: مقدمه and technical تحلیل of معماری.</w:t>
       </w:r>
     </w:p>
     <w:p>
@@ -6154,7 +5389,7 @@
           <w:sz w:val="24"/>
           <w:color w:val="1E293B"/>
         </w:rPr>
-        <w:t>محتوای صفحه 134: مقدمه و تحلیل فنی معماری.</w:t>
+        <w:t>صفحه 134 content: مقدمه and technical تحلیل of معماری.</w:t>
       </w:r>
     </w:p>
     <w:p>
@@ -6192,7 +5427,7 @@
           <w:sz w:val="24"/>
           <w:color w:val="1E293B"/>
         </w:rPr>
-        <w:t>محتوای صفحه 135: مقدمه و تحلیل فنی معماری.</w:t>
+        <w:t>صفحه 135 content: مقدمه and technical تحلیل of معماری.</w:t>
       </w:r>
     </w:p>
     <w:p>
@@ -6230,7 +5465,7 @@
           <w:sz w:val="24"/>
           <w:color w:val="1E293B"/>
         </w:rPr>
-        <w:t>محتوای صفحه 136: مقدمه و تحلیل فنی معماری.</w:t>
+        <w:t>صفحه 136 content: مقدمه and technical تحلیل of معماری.</w:t>
       </w:r>
     </w:p>
     <w:p>
@@ -6268,7 +5503,7 @@
           <w:sz w:val="24"/>
           <w:color w:val="1E293B"/>
         </w:rPr>
-        <w:t>محتوای صفحه 137: مقدمه و تحلیل فنی معماری.</w:t>
+        <w:t>صفحه 137 content: مقدمه and technical تحلیل of معماری.</w:t>
       </w:r>
     </w:p>
     <w:p>
@@ -6306,7 +5541,7 @@
           <w:sz w:val="24"/>
           <w:color w:val="1E293B"/>
         </w:rPr>
-        <w:t>محتوای صفحه 138: مقدمه و تحلیل فنی معماری.</w:t>
+        <w:t>صفحه 138 content: مقدمه and technical تحلیل of معماری.</w:t>
       </w:r>
     </w:p>
     <w:p>
@@ -6344,7 +5579,7 @@
           <w:sz w:val="24"/>
           <w:color w:val="1E293B"/>
         </w:rPr>
-        <w:t>محتوای صفحه 139: مقدمه و تحلیل فنی معماری.</w:t>
+        <w:t>صفحه 139 content: مقدمه and technical تحلیل of معماری.</w:t>
       </w:r>
     </w:p>
     <w:p>
@@ -6382,7 +5617,7 @@
           <w:sz w:val="24"/>
           <w:color w:val="1E293B"/>
         </w:rPr>
-        <w:t>محتوای صفحه 140: مقدمه و تحلیل فنی معماری.</w:t>
+        <w:t>صفحه 140 content: مقدمه and technical تحلیل of معماری.</w:t>
       </w:r>
     </w:p>
     <w:p>
@@ -6420,7 +5655,7 @@
           <w:sz w:val="24"/>
           <w:color w:val="1E293B"/>
         </w:rPr>
-        <w:t>محتوای صفحه 141: مقدمه و تحلیل فنی معماری.</w:t>
+        <w:t>صفحه 141 content: مقدمه and technical تحلیل of معماری.</w:t>
       </w:r>
     </w:p>
     <w:p>
@@ -6458,7 +5693,7 @@
           <w:sz w:val="24"/>
           <w:color w:val="1E293B"/>
         </w:rPr>
-        <w:t>محتوای صفحه 142: مقدمه و تحلیل فنی معماری.</w:t>
+        <w:t>صفحه 142 content: مقدمه and technical تحلیل of معماری.</w:t>
       </w:r>
     </w:p>
     <w:p>
@@ -6496,7 +5731,7 @@
           <w:sz w:val="24"/>
           <w:color w:val="1E293B"/>
         </w:rPr>
-        <w:t>محتوای صفحه 143: مقدمه و تحلیل فنی معماری.</w:t>
+        <w:t>صفحه 143 content: مقدمه and technical تحلیل of معماری.</w:t>
       </w:r>
     </w:p>
     <w:p>
@@ -6534,7 +5769,7 @@
           <w:sz w:val="24"/>
           <w:color w:val="1E293B"/>
         </w:rPr>
-        <w:t>محتوای صفحه 144: مقدمه و تحلیل فنی معماری.</w:t>
+        <w:t>صفحه 144 content: مقدمه and technical تحلیل of معماری.</w:t>
       </w:r>
     </w:p>
     <w:p>
@@ -6572,7 +5807,7 @@
           <w:sz w:val="24"/>
           <w:color w:val="1E293B"/>
         </w:rPr>
-        <w:t>محتوای صفحه 145: مقدمه و تحلیل فنی معماری.</w:t>
+        <w:t>صفحه 145 content: مقدمه and technical تحلیل of معماری.</w:t>
       </w:r>
     </w:p>
     <w:p>
@@ -6610,7 +5845,7 @@
           <w:sz w:val="24"/>
           <w:color w:val="1E293B"/>
         </w:rPr>
-        <w:t>محتوای صفحه 146: مقدمه و تحلیل فنی معماری.</w:t>
+        <w:t>صفحه 146 content: مقدمه and technical تحلیل of معماری.</w:t>
       </w:r>
     </w:p>
     <w:p>
@@ -6648,7 +5883,7 @@
           <w:sz w:val="24"/>
           <w:color w:val="1E293B"/>
         </w:rPr>
-        <w:t>محتوای صفحه 147: مقدمه و تحلیل فنی معماری.</w:t>
+        <w:t>صفحه 147 content: مقدمه and technical تحلیل of معماری.</w:t>
       </w:r>
     </w:p>
     <w:p>
@@ -6762,247 +5997,157 @@
           <w:sz w:val="24"/>
           <w:color w:val="1E293B"/>
         </w:rPr>
-        <w:t>دفترچه راهنمای سیستم‌های برقی و الکترونیکی خودرو</w:t>
-      </w:r>
-    </w:p>
-    <w:p>
-      <w:pPr>
-        <w:bidi/>
-        <w:jc w:val="right"/>
-        <w:spacing w:line="360" w:lineRule="auto"/>
-      </w:pPr>
-      <w:r>
-        <w:rPr>
-          <w:rtl/>
-          <w:sz w:val="24"/>
-          <w:color w:val="1E293B"/>
-        </w:rPr>
-        <w:t>بخش سیستم تهویه مطبوع (AC)</w:t>
-      </w:r>
-    </w:p>
-    <w:p>
-      <w:pPr>
-        <w:bidi/>
-        <w:jc w:val="right"/>
-        <w:spacing w:line="360" w:lineRule="auto"/>
-      </w:pPr>
-      <w:r>
-        <w:rPr>
-          <w:rtl/>
-          <w:sz w:val="24"/>
-          <w:color w:val="1E293B"/>
-        </w:rPr>
-        <w:t>شکل ۱: نمودار سیم‌کشی کنترل‌کننده مرکزی</w:t>
-      </w:r>
-    </w:p>
-    <w:p>
-      <w:pPr>
-        <w:bidi/>
-        <w:jc w:val="right"/>
-        <w:spacing w:line="360" w:lineRule="auto"/>
-      </w:pPr>
-      <w:r>
-        <w:rPr>
-          <w:rtl/>
-          <w:sz w:val="24"/>
-          <w:color w:val="1E293B"/>
-        </w:rPr>
-        <w:t>۱. واحد کنترل الکترونیکی (ECU)</w:t>
-      </w:r>
-    </w:p>
-    <w:p>
-      <w:pPr>
-        <w:bidi/>
-        <w:jc w:val="right"/>
-        <w:spacing w:line="360" w:lineRule="auto"/>
-      </w:pPr>
-      <w:r>
-        <w:rPr>
-          <w:rtl/>
-          <w:sz w:val="24"/>
-          <w:color w:val="1E293B"/>
-        </w:rPr>
-        <w:t>۲. سنسور دمای محیط</w:t>
-      </w:r>
-    </w:p>
-    <w:p>
-      <w:pPr>
-        <w:bidi/>
-        <w:jc w:val="right"/>
-        <w:spacing w:line="360" w:lineRule="auto"/>
-      </w:pPr>
-      <w:r>
-        <w:rPr>
-          <w:rtl/>
-          <w:sz w:val="24"/>
-          <w:color w:val="1E293B"/>
-        </w:rPr>
-        <w:t>۳. موتور دریچه گردش هوا (Recirculation Motor)</w:t>
-      </w:r>
-    </w:p>
-    <w:p>
-      <w:pPr>
-        <w:bidi/>
-        <w:jc w:val="right"/>
-        <w:spacing w:line="360" w:lineRule="auto"/>
-      </w:pPr>
-      <w:r>
-        <w:rPr>
-          <w:rtl/>
-          <w:sz w:val="24"/>
-          <w:color w:val="1E293B"/>
-        </w:rPr>
-        <w:t>۴. رله فن خنک‌کننده</w:t>
-      </w:r>
-    </w:p>
-    <w:p>
-      <w:pPr>
-        <w:bidi/>
-        <w:jc w:val="right"/>
-        <w:spacing w:line="360" w:lineRule="auto"/>
-      </w:pPr>
-      <w:r>
-        <w:rPr>
-          <w:rtl/>
-          <w:sz w:val="24"/>
-          <w:color w:val="1E293B"/>
-        </w:rPr>
-        <w:t>۵. کلید فشار گاز کولر (Pressure Switch)</w:t>
-      </w:r>
-    </w:p>
-    <w:p>
-      <w:pPr>
-        <w:bidi/>
-        <w:jc w:val="right"/>
-        <w:spacing w:line="360" w:lineRule="auto"/>
-      </w:pPr>
-      <w:r>
-        <w:rPr>
-          <w:rtl/>
-          <w:sz w:val="24"/>
-          <w:color w:val="1E293B"/>
-        </w:rPr>
-        <w:t>۶. کمپرسور کولر</w:t>
-      </w:r>
-    </w:p>
-    <w:p>
-      <w:pPr>
-        <w:bidi/>
-        <w:jc w:val="right"/>
-        <w:spacing w:line="360" w:lineRule="auto"/>
-      </w:pPr>
-      <w:r>
-        <w:rPr>
-          <w:rtl/>
-          <w:sz w:val="24"/>
-          <w:color w:val="1E293B"/>
-        </w:rPr>
-        <w:t>۷. مقاومت فن بخاری (Blower Resistor)</w:t>
-      </w:r>
-    </w:p>
-    <w:p>
-      <w:pPr>
-        <w:bidi/>
-        <w:jc w:val="right"/>
-        <w:spacing w:line="360" w:lineRule="auto"/>
-      </w:pPr>
-      <w:r>
-        <w:rPr>
-          <w:rtl/>
-          <w:sz w:val="24"/>
-          <w:color w:val="1E293B"/>
-        </w:rPr>
-        <w:t>۸. پنل تنظیمات دستی تهویه</w:t>
-      </w:r>
-    </w:p>
-    <w:p>
-      <w:pPr>
-        <w:bidi/>
-        <w:jc w:val="right"/>
-        <w:spacing w:line="360" w:lineRule="auto"/>
-      </w:pPr>
-      <w:r>
-        <w:rPr>
-          <w:rtl/>
-          <w:sz w:val="24"/>
-          <w:color w:val="1E293B"/>
-        </w:rPr>
-        <w:t>۹. فیوز اصلی سیستم تهویه</w:t>
-      </w:r>
-    </w:p>
-    <w:p>
-      <w:pPr>
-        <w:bidi/>
-        <w:jc w:val="right"/>
-        <w:spacing w:line="360" w:lineRule="auto"/>
-      </w:pPr>
-      <w:r>
-        <w:rPr>
-          <w:rtl/>
-          <w:sz w:val="24"/>
-          <w:color w:val="1E293B"/>
-        </w:rPr>
-        <w:t>۱۰. اتصال بدنه (Ground)</w:t>
-      </w:r>
-    </w:p>
-    <w:p>
-      <w:pPr>
-        <w:bidi/>
-        <w:jc w:val="right"/>
-        <w:spacing w:line="360" w:lineRule="auto"/>
-      </w:pPr>
-      <w:r>
-        <w:rPr>
-          <w:rtl/>
-          <w:sz w:val="24"/>
-          <w:color w:val="1E293B"/>
-        </w:rPr>
-        <w:t>توضیحات:</w:t>
-      </w:r>
-    </w:p>
-    <w:p>
-      <w:pPr>
-        <w:bidi/>
-        <w:jc w:val="right"/>
-        <w:spacing w:line="360" w:lineRule="auto"/>
-      </w:pPr>
-      <w:r>
-        <w:rPr>
-          <w:rtl/>
-          <w:sz w:val="24"/>
-          <w:color w:val="1E293B"/>
-        </w:rPr>
-        <w:t>تمامی اتصالات باید طبق استانداردهای عایق‌بندی بررسی شوند.</w:t>
-      </w:r>
-    </w:p>
-    <w:p>
-      <w:pPr>
-        <w:bidi/>
-        <w:jc w:val="right"/>
-        <w:spacing w:line="360" w:lineRule="auto"/>
-      </w:pPr>
-      <w:r>
-        <w:rPr>
-          <w:rtl/>
-          <w:sz w:val="24"/>
-          <w:color w:val="1E293B"/>
-        </w:rPr>
-        <w:t>در صورت بروز نوسان، فیوز شماره ۹ بررسی گردد.</w:t>
-      </w:r>
-    </w:p>
-    <w:p>
-      <w:pPr>
-        <w:bidi/>
-        <w:jc w:val="right"/>
-        <w:spacing w:line="360" w:lineRule="auto"/>
-      </w:pPr>
-      <w:r>
-        <w:rPr>
-          <w:rtl/>
-          <w:sz w:val="24"/>
-          <w:color w:val="1E293B"/>
-        </w:rPr>
-        <w:t>مقادیر ولتاژ در حالت سوئیچ باز اندازه‌گیری شود.</w:t>
+        <w:t>دیاگرام ۱۵۰</w:t>
+      </w:r>
+    </w:p>
+    <w:p>
+      <w:pPr>
+        <w:bidi/>
+        <w:jc w:val="right"/>
+        <w:spacing w:line="360" w:lineRule="auto"/>
+      </w:pPr>
+      <w:r>
+        <w:rPr>
+          <w:rtl/>
+          <w:sz w:val="24"/>
+          <w:color w:val="1E293B"/>
+        </w:rPr>
+        <w:t>چرخه حیات یک ستاره</w:t>
+      </w:r>
+    </w:p>
+    <w:p>
+      <w:pPr>
+        <w:bidi/>
+        <w:jc w:val="right"/>
+        <w:spacing w:line="360" w:lineRule="auto"/>
+      </w:pPr>
+      <w:r>
+        <w:rPr>
+          <w:rtl/>
+          <w:sz w:val="24"/>
+          <w:color w:val="1E293B"/>
+        </w:rPr>
+        <w:t>۱. سحابی (ابر گاز و غبار)</w:t>
+      </w:r>
+    </w:p>
+    <w:p>
+      <w:pPr>
+        <w:bidi/>
+        <w:jc w:val="right"/>
+        <w:spacing w:line="360" w:lineRule="auto"/>
+      </w:pPr>
+      <w:r>
+        <w:rPr>
+          <w:rtl/>
+          <w:sz w:val="24"/>
+          <w:color w:val="1E293B"/>
+        </w:rPr>
+        <w:t>۲. پیشستاره</w:t>
+      </w:r>
+    </w:p>
+    <w:p>
+      <w:pPr>
+        <w:bidi/>
+        <w:jc w:val="right"/>
+        <w:spacing w:line="360" w:lineRule="auto"/>
+      </w:pPr>
+      <w:r>
+        <w:rPr>
+          <w:rtl/>
+          <w:sz w:val="24"/>
+          <w:color w:val="1E293B"/>
+        </w:rPr>
+        <w:t>۳. ستاره رشته اصلی</w:t>
+      </w:r>
+    </w:p>
+    <w:p>
+      <w:pPr>
+        <w:bidi/>
+        <w:jc w:val="right"/>
+        <w:spacing w:line="360" w:lineRule="auto"/>
+      </w:pPr>
+      <w:r>
+        <w:rPr>
+          <w:rtl/>
+          <w:sz w:val="24"/>
+          <w:color w:val="1E293B"/>
+        </w:rPr>
+        <w:t>۴. غول قرمز</w:t>
+      </w:r>
+    </w:p>
+    <w:p>
+      <w:pPr>
+        <w:bidi/>
+        <w:jc w:val="right"/>
+        <w:spacing w:line="360" w:lineRule="auto"/>
+      </w:pPr>
+      <w:r>
+        <w:rPr>
+          <w:rtl/>
+          <w:sz w:val="24"/>
+          <w:color w:val="1E293B"/>
+        </w:rPr>
+        <w:t>۵. سحابی سیارهنما</w:t>
+      </w:r>
+    </w:p>
+    <w:p>
+      <w:pPr>
+        <w:bidi/>
+        <w:jc w:val="right"/>
+        <w:spacing w:line="360" w:lineRule="auto"/>
+      </w:pPr>
+      <w:r>
+        <w:rPr>
+          <w:rtl/>
+          <w:sz w:val="24"/>
+          <w:color w:val="1E293B"/>
+        </w:rPr>
+        <w:t>۶. کوتوله سفید</w:t>
+      </w:r>
+    </w:p>
+    <w:p>
+      <w:pPr>
+        <w:bidi/>
+        <w:jc w:val="right"/>
+        <w:spacing w:line="360" w:lineRule="auto"/>
+      </w:pPr>
+      <w:r>
+        <w:rPr>
+          <w:rtl/>
+          <w:sz w:val="24"/>
+          <w:color w:val="1E293B"/>
+        </w:rPr>
+        <w:t>۷. ابرنواختر</w:t>
+      </w:r>
+    </w:p>
+    <w:p>
+      <w:pPr>
+        <w:bidi/>
+        <w:jc w:val="right"/>
+        <w:spacing w:line="360" w:lineRule="auto"/>
+      </w:pPr>
+      <w:r>
+        <w:rPr>
+          <w:rtl/>
+          <w:sz w:val="24"/>
+          <w:color w:val="1E293B"/>
+        </w:rPr>
+        <w:t>۸. ستاره نوترونی</w:t>
+      </w:r>
+    </w:p>
+    <w:p>
+      <w:pPr>
+        <w:bidi/>
+        <w:jc w:val="right"/>
+        <w:spacing w:line="360" w:lineRule="auto"/>
+      </w:pPr>
+      <w:r>
+        <w:rPr>
+          <w:rtl/>
+          <w:sz w:val="24"/>
+          <w:color w:val="1E293B"/>
+        </w:rPr>
+        <w:t>۹. سیاهچاله</w:t>
       </w:r>
     </w:p>
     <w:p>
@@ -7420,7 +6565,7 @@
           <w:sz w:val="24"/>
           <w:color w:val="1E293B"/>
         </w:rPr>
-        <w:t>محتوای صفحه 161: مقدمه و تحلیل فنی معماری.</w:t>
+        <w:t>صفحه 161 content: مقدمه and technical تحلیل of معماری.</w:t>
       </w:r>
     </w:p>
     <w:p>
@@ -7458,7 +6603,7 @@
           <w:sz w:val="24"/>
           <w:color w:val="1E293B"/>
         </w:rPr>
-        <w:t>محتوای صفحه 162: مقدمه و تحلیل فنی معماری.</w:t>
+        <w:t>صفحه 162 content: مقدمه and technical تحلیل of معماری.</w:t>
       </w:r>
     </w:p>
     <w:p>
@@ -7496,7 +6641,7 @@
           <w:sz w:val="24"/>
           <w:color w:val="1E293B"/>
         </w:rPr>
-        <w:t>محتوای صفحه 163: مقدمه و تحلیل فنی معماری.</w:t>
+        <w:t>صفحه 163 content: مقدمه and technical تحلیل of معماری.</w:t>
       </w:r>
     </w:p>
     <w:p>
@@ -7534,7 +6679,7 @@
           <w:sz w:val="24"/>
           <w:color w:val="1E293B"/>
         </w:rPr>
-        <w:t>محتوای صفحه 164: مقدمه و تحلیل فنی معماری.</w:t>
+        <w:t>صفحه 164 content: مقدمه and technical تحلیل of معماری.</w:t>
       </w:r>
     </w:p>
     <w:p>
@@ -7572,7 +6717,7 @@
           <w:sz w:val="24"/>
           <w:color w:val="1E293B"/>
         </w:rPr>
-        <w:t>محتوای صفحه 165: مقدمه و تحلیل فنی معماری.</w:t>
+        <w:t>صفحه 165 content: مقدمه and technical تحلیل of معماری.</w:t>
       </w:r>
     </w:p>
     <w:p>
@@ -7610,7 +6755,7 @@
           <w:sz w:val="24"/>
           <w:color w:val="1E293B"/>
         </w:rPr>
-        <w:t>محتوای صفحه 166: مقدمه و تحلیل فنی معماری.</w:t>
+        <w:t>صفحه 166 content: مقدمه and technical تحلیل of معماری.</w:t>
       </w:r>
     </w:p>
     <w:p>
@@ -7648,7 +6793,7 @@
           <w:sz w:val="24"/>
           <w:color w:val="1E293B"/>
         </w:rPr>
-        <w:t>محتوای صفحه 167: مقدمه و تحلیل فنی معماری.</w:t>
+        <w:t>صفحه 167 content: مقدمه and technical تحلیل of معماری.</w:t>
       </w:r>
     </w:p>
     <w:p>
@@ -7686,7 +6831,7 @@
           <w:sz w:val="24"/>
           <w:color w:val="1E293B"/>
         </w:rPr>
-        <w:t>محتوای صفحه 168: مقدمه و تحلیل فنی معماری.</w:t>
+        <w:t>صفحه 168 content: مقدمه and technical تحلیل of معماری.</w:t>
       </w:r>
     </w:p>
     <w:p>
@@ -7724,7 +6869,7 @@
           <w:sz w:val="24"/>
           <w:color w:val="1E293B"/>
         </w:rPr>
-        <w:t>محتوای صفحه 169: مقدمه و تحلیل فنی معماری.</w:t>
+        <w:t>صفحه 169 content: مقدمه and technical تحلیل of معماری.</w:t>
       </w:r>
     </w:p>
     <w:p>
@@ -7762,7 +6907,7 @@
           <w:sz w:val="24"/>
           <w:color w:val="1E293B"/>
         </w:rPr>
-        <w:t>محتوای صفحه 170: مقدمه و تحلیل فنی معماری.</w:t>
+        <w:t>صفحه 170 content: مقدمه and technical تحلیل of معماری.</w:t>
       </w:r>
     </w:p>
     <w:p>

</xml_diff>